<commit_message>
fixed indice errors, just have to check that higher order solver is 4th order
</commit_message>
<xml_diff>
--- a/Project 4 - Adjoint Error Estimation/Programming Assignment 4.docx
+++ b/Project 4 - Adjoint Error Estimation/Programming Assignment 4.docx
@@ -3378,13 +3378,7 @@
                 <w:rPr>
                   <w:rFonts w:ascii="Cambria Math" w:eastAsia="Calibri" w:hAnsi="Cambria Math" w:cs="Calibri"/>
                 </w:rPr>
-                <m:t>(πx)</m:t>
-              </m:r>
-              <m:r>
-                <w:rPr>
-                  <w:rFonts w:ascii="Cambria Math" w:eastAsia="Calibri" w:hAnsi="Cambria Math" w:cs="Calibri"/>
-                </w:rPr>
-                <m:t>x</m:t>
+                <m:t>(πx)x</m:t>
               </m:r>
               <m:d>
                 <m:dPr>
@@ -3452,25 +3446,7 @@
                 <w:rPr>
                   <w:rFonts w:ascii="Cambria Math" w:eastAsia="Calibri" w:hAnsi="Cambria Math" w:cs="Calibri"/>
                 </w:rPr>
-                <m:t>(π</m:t>
-              </m:r>
-              <m:r>
-                <w:rPr>
-                  <w:rFonts w:ascii="Cambria Math" w:eastAsia="Calibri" w:hAnsi="Cambria Math" w:cs="Calibri"/>
-                </w:rPr>
-                <m:t>y</m:t>
-              </m:r>
-              <m:r>
-                <w:rPr>
-                  <w:rFonts w:ascii="Cambria Math" w:eastAsia="Calibri" w:hAnsi="Cambria Math" w:cs="Calibri"/>
-                </w:rPr>
-                <m:t>)</m:t>
-              </m:r>
-              <m:r>
-                <w:rPr>
-                  <w:rFonts w:ascii="Cambria Math" w:eastAsia="Calibri" w:hAnsi="Cambria Math" w:cs="Calibri"/>
-                </w:rPr>
-                <m:t>y</m:t>
+                <m:t>(πy)y</m:t>
               </m:r>
               <m:d>
                 <m:dPr>
@@ -3486,13 +3462,7 @@
                     <w:rPr>
                       <w:rFonts w:ascii="Cambria Math" w:eastAsia="Calibri" w:hAnsi="Cambria Math" w:cs="Calibri"/>
                     </w:rPr>
-                    <m:t>1-</m:t>
-                  </m:r>
-                  <m:r>
-                    <w:rPr>
-                      <w:rFonts w:ascii="Cambria Math" w:eastAsia="Calibri" w:hAnsi="Cambria Math" w:cs="Calibri"/>
-                    </w:rPr>
-                    <m:t>y</m:t>
+                    <m:t>1-y</m:t>
                   </m:r>
                 </m:e>
               </m:d>
@@ -3500,13 +3470,7 @@
                 <w:rPr>
                   <w:rFonts w:ascii="Cambria Math" w:eastAsia="Calibri" w:hAnsi="Cambria Math" w:cs="Calibri"/>
                 </w:rPr>
-                <m:t>d</m:t>
-              </m:r>
-              <m:r>
-                <w:rPr>
-                  <w:rFonts w:ascii="Cambria Math" w:eastAsia="Calibri" w:hAnsi="Cambria Math" w:cs="Calibri"/>
-                </w:rPr>
-                <m:t>y</m:t>
+                <m:t>dy</m:t>
               </m:r>
             </m:e>
           </m:nary>
@@ -3681,13 +3645,7 @@
                                 <w:rPr>
                                   <w:rFonts w:ascii="Cambria Math" w:eastAsia="Calibri" w:hAnsi="Cambria Math" w:cs="Calibri"/>
                                 </w:rPr>
-                                <m:t>π</m:t>
-                              </m:r>
-                              <m:r>
-                                <w:rPr>
-                                  <w:rFonts w:ascii="Cambria Math" w:eastAsia="Calibri" w:hAnsi="Cambria Math" w:cs="Calibri"/>
-                                </w:rPr>
-                                <m:t>γ</m:t>
+                                <m:t>πγ</m:t>
                               </m:r>
                             </m:e>
                           </m:d>
@@ -3713,13 +3671,7 @@
                             <w:rPr>
                               <w:rFonts w:ascii="Cambria Math" w:eastAsia="Calibri" w:hAnsi="Cambria Math" w:cs="Calibri"/>
                             </w:rPr>
-                            <m:t>1-</m:t>
-                          </m:r>
-                          <m:r>
-                            <w:rPr>
-                              <w:rFonts w:ascii="Cambria Math" w:eastAsia="Calibri" w:hAnsi="Cambria Math" w:cs="Calibri"/>
-                            </w:rPr>
-                            <m:t>γ</m:t>
+                            <m:t>1-γ</m:t>
                           </m:r>
                         </m:e>
                       </m:d>
@@ -3727,13 +3679,7 @@
                         <w:rPr>
                           <w:rFonts w:ascii="Cambria Math" w:eastAsia="Calibri" w:hAnsi="Cambria Math" w:cs="Calibri"/>
                         </w:rPr>
-                        <m:t>d</m:t>
-                      </m:r>
-                      <m:r>
-                        <w:rPr>
-                          <w:rFonts w:ascii="Cambria Math" w:eastAsia="Calibri" w:hAnsi="Cambria Math" w:cs="Calibri"/>
-                        </w:rPr>
-                        <m:t>γ</m:t>
+                        <m:t>dγ</m:t>
                       </m:r>
                     </m:e>
                   </m:nary>
@@ -4325,13 +4271,7 @@
             <w:rPr>
               <w:rFonts w:ascii="Cambria Math" w:eastAsia="Calibri" w:hAnsi="Cambria Math" w:cs="Calibri"/>
             </w:rPr>
-            <m:t>J</m:t>
-          </m:r>
-          <m:r>
-            <w:rPr>
-              <w:rFonts w:ascii="Cambria Math" w:eastAsia="Calibri" w:hAnsi="Cambria Math" w:cs="Calibri"/>
-            </w:rPr>
-            <m:t>=</m:t>
+            <m:t>J=</m:t>
           </m:r>
           <m:f>
             <m:fPr>
@@ -4864,13 +4804,7 @@
             <w:rPr>
               <w:rFonts w:ascii="Cambria Math" w:eastAsia="Calibri" w:hAnsi="Cambria Math" w:cs="Calibri"/>
             </w:rPr>
-            <m:t>J</m:t>
-          </m:r>
-          <m:r>
-            <w:rPr>
-              <w:rFonts w:ascii="Cambria Math" w:eastAsia="Calibri" w:hAnsi="Cambria Math" w:cs="Calibri"/>
-            </w:rPr>
-            <m:t>=</m:t>
+            <m:t>J=</m:t>
           </m:r>
           <m:f>
             <m:fPr>
@@ -5474,19 +5408,7 @@
         <w:rPr>
           <w:rFonts w:ascii="Calibri" w:eastAsia="Calibri" w:hAnsi="Calibri" w:cs="Calibri"/>
         </w:rPr>
-        <w:t xml:space="preserve">Evaluating the same terms at </w:t>
-      </w:r>
-      <w:r>
-        <w:rPr>
-          <w:rFonts w:ascii="Calibri" w:eastAsia="Calibri" w:hAnsi="Calibri" w:cs="Calibri"/>
-        </w:rPr>
-        <w:t>γ=</w:t>
-      </w:r>
-      <w:r>
-        <w:rPr>
-          <w:rFonts w:ascii="Calibri" w:eastAsia="Calibri" w:hAnsi="Calibri" w:cs="Calibri"/>
-        </w:rPr>
-        <w:t xml:space="preserve">0 yields, </w:t>
+        <w:t xml:space="preserve">Evaluating the same terms at γ=0 yields, </w:t>
       </w:r>
       <m:oMath>
         <m:r>
@@ -6172,7 +6094,7 @@
       <w:pPr>
         <w:spacing w:after="249"/>
         <w:ind w:firstLine="581"/>
-        <w:jc w:val="both"/>
+        <w:jc w:val="center"/>
         <w:rPr>
           <w:rFonts w:ascii="Calibri" w:eastAsia="Calibri" w:hAnsi="Calibri" w:cs="Calibri"/>
         </w:rPr>
@@ -6222,7 +6144,7 @@
       <w:pPr>
         <w:spacing w:after="249"/>
         <w:ind w:firstLine="581"/>
-        <w:jc w:val="both"/>
+        <w:jc w:val="center"/>
         <w:rPr>
           <w:rFonts w:ascii="Calibri" w:eastAsia="Calibri" w:hAnsi="Calibri" w:cs="Calibri"/>
         </w:rPr>
@@ -6272,7 +6194,7 @@
       <w:pPr>
         <w:spacing w:after="249"/>
         <w:ind w:firstLine="581"/>
-        <w:jc w:val="both"/>
+        <w:jc w:val="center"/>
         <w:rPr>
           <w:rFonts w:ascii="Calibri" w:eastAsia="Calibri" w:hAnsi="Calibri" w:cs="Calibri"/>
         </w:rPr>
@@ -6345,7 +6267,7 @@
       <w:pPr>
         <w:spacing w:after="249"/>
         <w:ind w:firstLine="581"/>
-        <w:jc w:val="both"/>
+        <w:jc w:val="center"/>
         <w:rPr>
           <w:rFonts w:ascii="Calibri" w:eastAsia="Calibri" w:hAnsi="Calibri" w:cs="Calibri"/>
         </w:rPr>
@@ -6682,6 +6604,171 @@
     </w:p>
     <w:p>
       <w:pPr>
+        <w:spacing w:after="207"/>
+        <w:ind w:left="581"/>
+      </w:pPr>
+      <w:r>
+        <w:t xml:space="preserve">In order to </w:t>
+      </w:r>
+      <w:r>
+        <w:t xml:space="preserve">compute an error estimate for the functional, </w:t>
+      </w:r>
+      <w:r>
+        <w:t xml:space="preserve">we will </w:t>
+      </w:r>
+      <w:r>
+        <w:t>need a higher order operator. In this case, we can use the 4</w:t>
+      </w:r>
+      <w:r>
+        <w:rPr>
+          <w:vertAlign w:val="superscript"/>
+        </w:rPr>
+        <w:t>th</w:t>
+      </w:r>
+      <w:r>
+        <w:t xml:space="preserve"> order discretization derivation provided on the course website</w:t>
+      </w:r>
+      <w:r>
+        <w:t>.</w:t>
+      </w:r>
+      <w:r>
+        <w:t xml:space="preserve"> This discretization uses a </w:t>
+      </w:r>
+      <w:r>
+        <w:t xml:space="preserve">5-point stencil. That is, </w:t>
+      </w:r>
+      <w:r>
+        <w:t xml:space="preserve">in order to require the solution, it </w:t>
+      </w:r>
+      <w:r>
+        <w:t xml:space="preserve">requires the solution in </w:t>
+      </w:r>
+      <w:r>
+        <w:t xml:space="preserve">the current cell, as well as the two preceding cells and the two proceeding cells. This means that a total of </w:t>
+      </w:r>
+      <w:r>
+        <w:t>2 ghost cells are needed on each side</w:t>
+      </w:r>
+      <w:r>
+        <w:t xml:space="preserve">, in order to maintain the boundary conditions. Unfortunately, all of the solver functions up to this point are coded in a way that they take an array </w:t>
+      </w:r>
+      <w:r>
+        <w:t xml:space="preserve">with the number of cells + 2 entries as the input, </w:t>
+      </w:r>
+      <w:r>
+        <w:t>to allow for one ghost cell on each side</w:t>
+      </w:r>
+      <w:r>
+        <w:t>.</w:t>
+      </w:r>
+      <w:r>
+        <w:t xml:space="preserve"> A new series of 4</w:t>
+      </w:r>
+      <w:r>
+        <w:rPr>
+          <w:vertAlign w:val="superscript"/>
+        </w:rPr>
+        <w:t>th</w:t>
+      </w:r>
+      <w:r>
+        <w:t xml:space="preserve"> order functions were written which </w:t>
+      </w:r>
+      <w:r>
+        <w:t xml:space="preserve">take the appropriately sized arrays to allow for 2 ghost cells on each side. </w:t>
+      </w:r>
+      <w:r>
+        <w:t>T</w:t>
+      </w:r>
+      <w:r>
+        <w:t>o ensure the indices for each of these new functions work, the functions were first tested using the same discretization as the 2</w:t>
+      </w:r>
+      <w:r>
+        <w:rPr>
+          <w:vertAlign w:val="superscript"/>
+        </w:rPr>
+        <w:t>nd</w:t>
+      </w:r>
+      <w:r>
+        <w:t xml:space="preserve"> order solver provided. The thought was that if all of the indices</w:t>
+      </w:r>
+      <w:r>
+        <w:t xml:space="preserve"> and boundary conditions</w:t>
+      </w:r>
+      <w:r>
+        <w:t xml:space="preserve"> worked properly, </w:t>
+      </w:r>
+      <w:r>
+        <w:t>the same solution should be obtained for the 2</w:t>
+      </w:r>
+      <w:r>
+        <w:rPr>
+          <w:vertAlign w:val="superscript"/>
+        </w:rPr>
+        <w:t>nd</w:t>
+      </w:r>
+      <w:r>
+        <w:t xml:space="preserve"> order and the 4</w:t>
+      </w:r>
+      <w:r>
+        <w:rPr>
+          <w:vertAlign w:val="superscript"/>
+        </w:rPr>
+        <w:t>th</w:t>
+      </w:r>
+      <w:r>
+        <w:t xml:space="preserve"> order solvers. </w:t>
+      </w:r>
+    </w:p>
+    <w:p>
+      <w:pPr>
+        <w:spacing w:after="207"/>
+        <w:ind w:left="581"/>
+        <w:jc w:val="center"/>
+      </w:pPr>
+      <w:r>
+        <w:rPr>
+          <w:noProof/>
+        </w:rPr>
+        <w:lastRenderedPageBreak/>
+        <w:drawing>
+          <wp:inline distT="0" distB="0" distL="0" distR="0" wp14:anchorId="635C5BAF" wp14:editId="693643C1">
+            <wp:extent cx="3257550" cy="4267200"/>
+            <wp:effectExtent l="0" t="0" r="0" b="0"/>
+            <wp:docPr id="5" name="Picture 5"/>
+            <wp:cNvGraphicFramePr>
+              <a:graphicFrameLocks xmlns:a="http://schemas.openxmlformats.org/drawingml/2006/main" noChangeAspect="1"/>
+            </wp:cNvGraphicFramePr>
+            <a:graphic xmlns:a="http://schemas.openxmlformats.org/drawingml/2006/main">
+              <a:graphicData uri="http://schemas.openxmlformats.org/drawingml/2006/picture">
+                <pic:pic xmlns:pic="http://schemas.openxmlformats.org/drawingml/2006/picture">
+                  <pic:nvPicPr>
+                    <pic:cNvPr id="1" name=""/>
+                    <pic:cNvPicPr/>
+                  </pic:nvPicPr>
+                  <pic:blipFill>
+                    <a:blip r:embed="rId13"/>
+                    <a:stretch>
+                      <a:fillRect/>
+                    </a:stretch>
+                  </pic:blipFill>
+                  <pic:spPr>
+                    <a:xfrm>
+                      <a:off x="0" y="0"/>
+                      <a:ext cx="3257550" cy="4267200"/>
+                    </a:xfrm>
+                    <a:prstGeom prst="rect">
+                      <a:avLst/>
+                    </a:prstGeom>
+                  </pic:spPr>
+                </pic:pic>
+              </a:graphicData>
+            </a:graphic>
+          </wp:inline>
+        </w:drawing>
+      </w:r>
+    </w:p>
+    <w:p>
+      <w:pPr>
         <w:numPr>
           <w:ilvl w:val="0"/>
           <w:numId w:val="1"/>
@@ -7248,6 +7335,7 @@
         <w:ind w:left="581"/>
       </w:pPr>
       <w:r>
+        <w:lastRenderedPageBreak/>
         <w:t>Compute this functional using both the primal and dual problems, and show that this formulation is adjoint consistent and converges with the correct order of accuracy.</w:t>
       </w:r>
     </w:p>
@@ -7317,7 +7405,7 @@
                     <pic:cNvPicPr/>
                   </pic:nvPicPr>
                   <pic:blipFill>
-                    <a:blip r:embed="rId13"/>
+                    <a:blip r:embed="rId14"/>
                     <a:stretch>
                       <a:fillRect/>
                     </a:stretch>
@@ -7351,7 +7439,6 @@
         <w:ind w:left="581"/>
       </w:pPr>
       <w:r>
-        <w:lastRenderedPageBreak/>
         <w:t xml:space="preserve">In the context of an optimization problem, we would need to be able to compute </w:t>
       </w:r>
       <w:r>
@@ -7372,7 +7459,7 @@
                     <pic:cNvPicPr/>
                   </pic:nvPicPr>
                   <pic:blipFill>
-                    <a:blip r:embed="rId14"/>
+                    <a:blip r:embed="rId15"/>
                     <a:stretch>
                       <a:fillRect/>
                     </a:stretch>
@@ -7630,7 +7717,7 @@
                     <pic:cNvPicPr/>
                   </pic:nvPicPr>
                   <pic:blipFill>
-                    <a:blip r:embed="rId15"/>
+                    <a:blip r:embed="rId16"/>
                     <a:stretch>
                       <a:fillRect/>
                     </a:stretch>
@@ -7674,7 +7761,7 @@
                     <pic:cNvPicPr/>
                   </pic:nvPicPr>
                   <pic:blipFill>
-                    <a:blip r:embed="rId16"/>
+                    <a:blip r:embed="rId17"/>
                     <a:stretch>
                       <a:fillRect/>
                     </a:stretch>
@@ -7725,7 +7812,7 @@
                     <pic:cNvPicPr/>
                   </pic:nvPicPr>
                   <pic:blipFill>
-                    <a:blip r:embed="rId16"/>
+                    <a:blip r:embed="rId17"/>
                     <a:stretch>
                       <a:fillRect/>
                     </a:stretch>
@@ -7917,7 +8004,7 @@
                     <pic:cNvPicPr/>
                   </pic:nvPicPr>
                   <pic:blipFill>
-                    <a:blip r:embed="rId17"/>
+                    <a:blip r:embed="rId18"/>
                     <a:stretch>
                       <a:fillRect/>
                     </a:stretch>
@@ -7983,7 +8070,7 @@
                     <pic:cNvPicPr/>
                   </pic:nvPicPr>
                   <pic:blipFill>
-                    <a:blip r:embed="rId18"/>
+                    <a:blip r:embed="rId19"/>
                     <a:stretch>
                       <a:fillRect/>
                     </a:stretch>
@@ -8036,7 +8123,7 @@
                     <pic:cNvPicPr/>
                   </pic:nvPicPr>
                   <pic:blipFill>
-                    <a:blip r:embed="rId19"/>
+                    <a:blip r:embed="rId20"/>
                     <a:stretch>
                       <a:fillRect/>
                     </a:stretch>
@@ -8091,7 +8178,7 @@
                     <pic:cNvPicPr/>
                   </pic:nvPicPr>
                   <pic:blipFill>
-                    <a:blip r:embed="rId20"/>
+                    <a:blip r:embed="rId21"/>
                     <a:stretch>
                       <a:fillRect/>
                     </a:stretch>

</xml_diff>

<commit_message>
bug in problem 3 too :(
</commit_message>
<xml_diff>
--- a/Project 4 - Adjoint Error Estimation/Programming Assignment 4.docx
+++ b/Project 4 - Adjoint Error Estimation/Programming Assignment 4.docx
@@ -253,7 +253,7 @@
                     <pic:cNvPicPr/>
                   </pic:nvPicPr>
                   <pic:blipFill>
-                    <a:blip r:embed="rId7"/>
+                    <a:blip r:embed="rId8"/>
                     <a:stretch>
                       <a:fillRect/>
                     </a:stretch>
@@ -308,7 +308,7 @@
                     <pic:cNvPicPr/>
                   </pic:nvPicPr>
                   <pic:blipFill>
-                    <a:blip r:embed="rId8"/>
+                    <a:blip r:embed="rId9"/>
                     <a:stretch>
                       <a:fillRect/>
                     </a:stretch>
@@ -360,6 +360,7 @@
         </w:rPr>
         <w:t>= (</w:t>
       </w:r>
+      <w:proofErr w:type="spellStart"/>
       <w:r>
         <w:rPr>
           <w:rFonts w:ascii="Calibri" w:eastAsia="Calibri" w:hAnsi="Calibri" w:cs="Calibri"/>
@@ -381,6 +382,7 @@
         </w:rPr>
         <w:t>g</w:t>
       </w:r>
+      <w:proofErr w:type="spellEnd"/>
       <w:r>
         <w:rPr>
           <w:rFonts w:ascii="Cambria" w:eastAsia="Cambria" w:hAnsi="Cambria" w:cs="Cambria"/>
@@ -6016,7 +6018,21 @@
         <w:rPr>
           <w:rFonts w:ascii="Calibri" w:eastAsia="Calibri" w:hAnsi="Calibri" w:cs="Calibri"/>
         </w:rPr>
-        <w:t xml:space="preserve">Thus, the solution to the functional for this case is found to be 1. Similar results can be determined by evaluating the functional as J=(v,f), assuming the exact solution to the adjoint problem, v, is known. </w:t>
+        <w:t>Thus, the solution to the functional for this case is found to be 1. Similar results can be determined by evaluating the functional as J=(</w:t>
+      </w:r>
+      <w:proofErr w:type="spellStart"/>
+      <w:r>
+        <w:rPr>
+          <w:rFonts w:ascii="Calibri" w:eastAsia="Calibri" w:hAnsi="Calibri" w:cs="Calibri"/>
+        </w:rPr>
+        <w:t>v,f</w:t>
+      </w:r>
+      <w:proofErr w:type="spellEnd"/>
+      <w:r>
+        <w:rPr>
+          <w:rFonts w:ascii="Calibri" w:eastAsia="Calibri" w:hAnsi="Calibri" w:cs="Calibri"/>
+        </w:rPr>
+        <w:t xml:space="preserve">), assuming the exact solution to the adjoint problem, v, is known. </w:t>
       </w:r>
     </w:p>
     <w:p>
@@ -6063,7 +6079,21 @@
         <w:rPr>
           <w:rFonts w:ascii="Calibri" w:eastAsia="Calibri" w:hAnsi="Calibri" w:cs="Calibri"/>
         </w:rPr>
-        <w:t xml:space="preserve">functional using both J=(u, g) and J=(v,f). In order to evaluate the integral, </w:t>
+        <w:t>functional using both J=(u, g) and J=(</w:t>
+      </w:r>
+      <w:proofErr w:type="spellStart"/>
+      <w:r>
+        <w:rPr>
+          <w:rFonts w:ascii="Calibri" w:eastAsia="Calibri" w:hAnsi="Calibri" w:cs="Calibri"/>
+        </w:rPr>
+        <w:t>v,f</w:t>
+      </w:r>
+      <w:proofErr w:type="spellEnd"/>
+      <w:r>
+        <w:rPr>
+          <w:rFonts w:ascii="Calibri" w:eastAsia="Calibri" w:hAnsi="Calibri" w:cs="Calibri"/>
+        </w:rPr>
+        <w:t xml:space="preserve">). In order to evaluate the integral, </w:t>
       </w:r>
       <w:r>
         <w:rPr>
@@ -6108,56 +6138,6 @@
             <wp:extent cx="3248025" cy="2314575"/>
             <wp:effectExtent l="0" t="0" r="9525" b="9525"/>
             <wp:docPr id="1" name="Picture 1"/>
-            <wp:cNvGraphicFramePr>
-              <a:graphicFrameLocks xmlns:a="http://schemas.openxmlformats.org/drawingml/2006/main" noChangeAspect="1"/>
-            </wp:cNvGraphicFramePr>
-            <a:graphic xmlns:a="http://schemas.openxmlformats.org/drawingml/2006/main">
-              <a:graphicData uri="http://schemas.openxmlformats.org/drawingml/2006/picture">
-                <pic:pic xmlns:pic="http://schemas.openxmlformats.org/drawingml/2006/picture">
-                  <pic:nvPicPr>
-                    <pic:cNvPr id="1" name=""/>
-                    <pic:cNvPicPr/>
-                  </pic:nvPicPr>
-                  <pic:blipFill>
-                    <a:blip r:embed="rId9"/>
-                    <a:stretch>
-                      <a:fillRect/>
-                    </a:stretch>
-                  </pic:blipFill>
-                  <pic:spPr>
-                    <a:xfrm>
-                      <a:off x="0" y="0"/>
-                      <a:ext cx="3248025" cy="2314575"/>
-                    </a:xfrm>
-                    <a:prstGeom prst="rect">
-                      <a:avLst/>
-                    </a:prstGeom>
-                  </pic:spPr>
-                </pic:pic>
-              </a:graphicData>
-            </a:graphic>
-          </wp:inline>
-        </w:drawing>
-      </w:r>
-    </w:p>
-    <w:p>
-      <w:pPr>
-        <w:spacing w:after="249"/>
-        <w:ind w:firstLine="581"/>
-        <w:jc w:val="center"/>
-        <w:rPr>
-          <w:rFonts w:ascii="Calibri" w:eastAsia="Calibri" w:hAnsi="Calibri" w:cs="Calibri"/>
-        </w:rPr>
-      </w:pPr>
-      <w:r>
-        <w:rPr>
-          <w:noProof/>
-        </w:rPr>
-        <w:drawing>
-          <wp:inline distT="0" distB="0" distL="0" distR="0" wp14:anchorId="305C03F6" wp14:editId="2CBEFA15">
-            <wp:extent cx="3248025" cy="2295525"/>
-            <wp:effectExtent l="0" t="0" r="9525" b="9525"/>
-            <wp:docPr id="2" name="Picture 2"/>
             <wp:cNvGraphicFramePr>
               <a:graphicFrameLocks xmlns:a="http://schemas.openxmlformats.org/drawingml/2006/main" noChangeAspect="1"/>
             </wp:cNvGraphicFramePr>
@@ -6177,7 +6157,7 @@
                   <pic:spPr>
                     <a:xfrm>
                       <a:off x="0" y="0"/>
-                      <a:ext cx="3248025" cy="2295525"/>
+                      <a:ext cx="3248025" cy="2314575"/>
                     </a:xfrm>
                     <a:prstGeom prst="rect">
                       <a:avLst/>
@@ -6203,12 +6183,11 @@
         <w:rPr>
           <w:noProof/>
         </w:rPr>
-        <w:lastRenderedPageBreak/>
         <w:drawing>
-          <wp:inline distT="0" distB="0" distL="0" distR="0" wp14:anchorId="73BC918C" wp14:editId="6958A715">
-            <wp:extent cx="3305175" cy="2305050"/>
-            <wp:effectExtent l="0" t="0" r="9525" b="0"/>
-            <wp:docPr id="3" name="Picture 3"/>
+          <wp:inline distT="0" distB="0" distL="0" distR="0" wp14:anchorId="305C03F6" wp14:editId="2CBEFA15">
+            <wp:extent cx="3248025" cy="2295525"/>
+            <wp:effectExtent l="0" t="0" r="9525" b="9525"/>
+            <wp:docPr id="2" name="Picture 2"/>
             <wp:cNvGraphicFramePr>
               <a:graphicFrameLocks xmlns:a="http://schemas.openxmlformats.org/drawingml/2006/main" noChangeAspect="1"/>
             </wp:cNvGraphicFramePr>
@@ -6228,6 +6207,57 @@
                   <pic:spPr>
                     <a:xfrm>
                       <a:off x="0" y="0"/>
+                      <a:ext cx="3248025" cy="2295525"/>
+                    </a:xfrm>
+                    <a:prstGeom prst="rect">
+                      <a:avLst/>
+                    </a:prstGeom>
+                  </pic:spPr>
+                </pic:pic>
+              </a:graphicData>
+            </a:graphic>
+          </wp:inline>
+        </w:drawing>
+      </w:r>
+    </w:p>
+    <w:p>
+      <w:pPr>
+        <w:spacing w:after="249"/>
+        <w:ind w:firstLine="581"/>
+        <w:jc w:val="center"/>
+        <w:rPr>
+          <w:rFonts w:ascii="Calibri" w:eastAsia="Calibri" w:hAnsi="Calibri" w:cs="Calibri"/>
+        </w:rPr>
+      </w:pPr>
+      <w:r>
+        <w:rPr>
+          <w:noProof/>
+        </w:rPr>
+        <w:lastRenderedPageBreak/>
+        <w:drawing>
+          <wp:inline distT="0" distB="0" distL="0" distR="0" wp14:anchorId="73BC918C" wp14:editId="6958A715">
+            <wp:extent cx="3305175" cy="2305050"/>
+            <wp:effectExtent l="0" t="0" r="9525" b="0"/>
+            <wp:docPr id="3" name="Picture 3"/>
+            <wp:cNvGraphicFramePr>
+              <a:graphicFrameLocks xmlns:a="http://schemas.openxmlformats.org/drawingml/2006/main" noChangeAspect="1"/>
+            </wp:cNvGraphicFramePr>
+            <a:graphic xmlns:a="http://schemas.openxmlformats.org/drawingml/2006/main">
+              <a:graphicData uri="http://schemas.openxmlformats.org/drawingml/2006/picture">
+                <pic:pic xmlns:pic="http://schemas.openxmlformats.org/drawingml/2006/picture">
+                  <pic:nvPicPr>
+                    <pic:cNvPr id="1" name=""/>
+                    <pic:cNvPicPr/>
+                  </pic:nvPicPr>
+                  <pic:blipFill>
+                    <a:blip r:embed="rId12"/>
+                    <a:stretch>
+                      <a:fillRect/>
+                    </a:stretch>
+                  </pic:blipFill>
+                  <pic:spPr>
+                    <a:xfrm>
+                      <a:off x="0" y="0"/>
                       <a:ext cx="3305175" cy="2305050"/>
                     </a:xfrm>
                     <a:prstGeom prst="rect">
@@ -6295,7 +6325,7 @@
                     </pic:cNvPicPr>
                   </pic:nvPicPr>
                   <pic:blipFill>
-                    <a:blip r:embed="rId12">
+                    <a:blip r:embed="rId13">
                       <a:extLst>
                         <a:ext uri="{28A0092B-C50C-407E-A947-70E740481C1C}">
                           <a14:useLocalDpi xmlns:a14="http://schemas.microsoft.com/office/drawing/2010/main" val="0"/>
@@ -6552,6 +6582,7 @@
       <w:r>
         <w:t xml:space="preserve">In this case, your high-order operator will fill the role of </w:t>
       </w:r>
+      <w:proofErr w:type="spellStart"/>
       <w:r>
         <w:rPr>
           <w:rFonts w:ascii="Calibri" w:eastAsia="Calibri" w:hAnsi="Calibri" w:cs="Calibri"/>
@@ -6565,7 +6596,16 @@
           <w:i/>
           <w:vertAlign w:val="subscript"/>
         </w:rPr>
-        <w:t xml:space="preserve">h </w:t>
+        <w:t>h</w:t>
+      </w:r>
+      <w:proofErr w:type="spellEnd"/>
+      <w:r>
+        <w:rPr>
+          <w:rFonts w:ascii="Calibri" w:eastAsia="Calibri" w:hAnsi="Calibri" w:cs="Calibri"/>
+          <w:i/>
+          <w:vertAlign w:val="subscript"/>
+        </w:rPr>
+        <w:t xml:space="preserve"> </w:t>
       </w:r>
       <w:r>
         <w:t>without any need for high</w:t>
@@ -6746,7 +6786,7 @@
                     <pic:cNvPicPr/>
                   </pic:nvPicPr>
                   <pic:blipFill>
-                    <a:blip r:embed="rId13"/>
+                    <a:blip r:embed="rId14"/>
                     <a:stretch>
                       <a:fillRect/>
                     </a:stretch>
@@ -6769,6 +6809,337 @@
     </w:p>
     <w:p>
       <w:pPr>
+        <w:spacing w:after="207"/>
+        <w:ind w:left="581"/>
+        <w:rPr>
+          <w:color w:val="000000"/>
+        </w:rPr>
+      </w:pPr>
+      <w:r>
+        <w:t xml:space="preserve">Once this was completed, the boundary conditions </w:t>
+      </w:r>
+      <w:r>
+        <w:t xml:space="preserve">and the </w:t>
+      </w:r>
+      <w:r>
+        <w:t>4</w:t>
+      </w:r>
+      <w:r>
+        <w:rPr>
+          <w:vertAlign w:val="superscript"/>
+        </w:rPr>
+        <w:t>th</w:t>
+      </w:r>
+      <w:r>
+        <w:t xml:space="preserve"> order discretization. The 4</w:t>
+      </w:r>
+      <w:r>
+        <w:rPr>
+          <w:vertAlign w:val="superscript"/>
+        </w:rPr>
+        <w:t>th</w:t>
+      </w:r>
+      <w:r>
+        <w:t xml:space="preserve"> order discretization for the Poisson equation was taken from the provided derivation on Canvas, while the boundary conditions were taken from a paper found online. </w:t>
+      </w:r>
+      <w:sdt>
+        <w:sdtPr>
+          <w:rPr>
+            <w:color w:val="000000"/>
+          </w:rPr>
+          <w:tag w:val="MENDELEY_CITATION_v3_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"/>
+          <w:id w:val="1636840539"/>
+          <w:placeholder>
+            <w:docPart w:val="DefaultPlaceholder_-1854013440"/>
+          </w:placeholder>
+        </w:sdtPr>
+        <w:sdtContent>
+          <w:r>
+            <w:rPr>
+              <w:color w:val="000000"/>
+            </w:rPr>
+            <w:t>[1]</w:t>
+          </w:r>
+        </w:sdtContent>
+      </w:sdt>
+      <w:r>
+        <w:rPr>
+          <w:color w:val="000000"/>
+        </w:rPr>
+        <w:t xml:space="preserve"> A test was performed with </w:t>
+      </w:r>
+      <w:r>
+        <w:rPr>
+          <w:color w:val="000000"/>
+        </w:rPr>
+        <w:t>a 0</w:t>
+      </w:r>
+      <w:r>
+        <w:rPr>
+          <w:color w:val="000000"/>
+        </w:rPr>
+        <w:t xml:space="preserve"> </w:t>
+      </w:r>
+      <w:r>
+        <w:rPr>
+          <w:color w:val="000000"/>
+        </w:rPr>
+        <w:t>source term to ensure that the homogenous boundary conditions were met</w:t>
+      </w:r>
+      <w:r>
+        <w:rPr>
+          <w:color w:val="000000"/>
+        </w:rPr>
+        <w:t xml:space="preserve">. Once this test was passed, the final code was written such that it would </w:t>
+      </w:r>
+      <w:r>
+        <w:rPr>
+          <w:color w:val="000000"/>
+        </w:rPr>
+        <w:t>compute the solution to the Poisson equation with 4</w:t>
+      </w:r>
+      <w:r>
+        <w:rPr>
+          <w:color w:val="000000"/>
+          <w:vertAlign w:val="superscript"/>
+        </w:rPr>
+        <w:t>th</w:t>
+      </w:r>
+      <w:r>
+        <w:rPr>
+          <w:color w:val="000000"/>
+        </w:rPr>
+        <w:t xml:space="preserve"> order spatial accuracy. Unfortunately, a bug still exists in the code, and due to time constraints, it could not be fixed. The solution currently being output </w:t>
+      </w:r>
+      <w:r>
+        <w:rPr>
+          <w:color w:val="000000"/>
+        </w:rPr>
+        <w:t>can be found below,</w:t>
+      </w:r>
+    </w:p>
+    <w:p>
+      <w:pPr>
+        <w:spacing w:after="207"/>
+        <w:ind w:left="581"/>
+        <w:jc w:val="center"/>
+      </w:pPr>
+      <w:r>
+        <w:rPr>
+          <w:noProof/>
+        </w:rPr>
+        <w:lastRenderedPageBreak/>
+        <w:drawing>
+          <wp:inline distT="0" distB="0" distL="0" distR="0" wp14:anchorId="1A33FFA6" wp14:editId="019ED118">
+            <wp:extent cx="5943600" cy="5012690"/>
+            <wp:effectExtent l="0" t="0" r="0" b="0"/>
+            <wp:docPr id="6" name="Picture 6"/>
+            <wp:cNvGraphicFramePr>
+              <a:graphicFrameLocks xmlns:a="http://schemas.openxmlformats.org/drawingml/2006/main" noChangeAspect="1"/>
+            </wp:cNvGraphicFramePr>
+            <a:graphic xmlns:a="http://schemas.openxmlformats.org/drawingml/2006/main">
+              <a:graphicData uri="http://schemas.openxmlformats.org/drawingml/2006/picture">
+                <pic:pic xmlns:pic="http://schemas.openxmlformats.org/drawingml/2006/picture">
+                  <pic:nvPicPr>
+                    <pic:cNvPr id="1" name=""/>
+                    <pic:cNvPicPr/>
+                  </pic:nvPicPr>
+                  <pic:blipFill>
+                    <a:blip r:embed="rId15"/>
+                    <a:stretch>
+                      <a:fillRect/>
+                    </a:stretch>
+                  </pic:blipFill>
+                  <pic:spPr>
+                    <a:xfrm>
+                      <a:off x="0" y="0"/>
+                      <a:ext cx="5943600" cy="5012690"/>
+                    </a:xfrm>
+                    <a:prstGeom prst="rect">
+                      <a:avLst/>
+                    </a:prstGeom>
+                  </pic:spPr>
+                </pic:pic>
+              </a:graphicData>
+            </a:graphic>
+          </wp:inline>
+        </w:drawing>
+      </w:r>
+    </w:p>
+    <w:p>
+      <w:pPr>
+        <w:spacing w:after="207"/>
+        <w:ind w:left="581"/>
+      </w:pPr>
+      <w:r>
+        <w:t>The solution computed with the 2</w:t>
+      </w:r>
+      <w:r>
+        <w:rPr>
+          <w:vertAlign w:val="superscript"/>
+        </w:rPr>
+        <w:t>nd</w:t>
+      </w:r>
+      <w:r>
+        <w:t xml:space="preserve"> order solver (which we know works), is</w:t>
+      </w:r>
+    </w:p>
+    <w:p>
+      <w:pPr>
+        <w:spacing w:after="207"/>
+        <w:ind w:left="581"/>
+        <w:jc w:val="center"/>
+      </w:pPr>
+      <w:r>
+        <w:rPr>
+          <w:noProof/>
+        </w:rPr>
+        <w:lastRenderedPageBreak/>
+        <w:drawing>
+          <wp:inline distT="0" distB="0" distL="0" distR="0" wp14:anchorId="338D7DD0" wp14:editId="34EFC90F">
+            <wp:extent cx="5943600" cy="5094605"/>
+            <wp:effectExtent l="0" t="0" r="0" b="0"/>
+            <wp:docPr id="7" name="Picture 7"/>
+            <wp:cNvGraphicFramePr>
+              <a:graphicFrameLocks xmlns:a="http://schemas.openxmlformats.org/drawingml/2006/main" noChangeAspect="1"/>
+            </wp:cNvGraphicFramePr>
+            <a:graphic xmlns:a="http://schemas.openxmlformats.org/drawingml/2006/main">
+              <a:graphicData uri="http://schemas.openxmlformats.org/drawingml/2006/picture">
+                <pic:pic xmlns:pic="http://schemas.openxmlformats.org/drawingml/2006/picture">
+                  <pic:nvPicPr>
+                    <pic:cNvPr id="1" name=""/>
+                    <pic:cNvPicPr/>
+                  </pic:nvPicPr>
+                  <pic:blipFill>
+                    <a:blip r:embed="rId16"/>
+                    <a:stretch>
+                      <a:fillRect/>
+                    </a:stretch>
+                  </pic:blipFill>
+                  <pic:spPr>
+                    <a:xfrm>
+                      <a:off x="0" y="0"/>
+                      <a:ext cx="5943600" cy="5094605"/>
+                    </a:xfrm>
+                    <a:prstGeom prst="rect">
+                      <a:avLst/>
+                    </a:prstGeom>
+                  </pic:spPr>
+                </pic:pic>
+              </a:graphicData>
+            </a:graphic>
+          </wp:inline>
+        </w:drawing>
+      </w:r>
+    </w:p>
+    <w:p>
+      <w:pPr>
+        <w:spacing w:after="207"/>
+        <w:ind w:left="581"/>
+      </w:pPr>
+      <w:r>
+        <w:t xml:space="preserve">As can be seen, the </w:t>
+      </w:r>
+      <w:r>
+        <w:t xml:space="preserve">code vastly underestimates </w:t>
+      </w:r>
+      <w:r>
+        <w:t xml:space="preserve">the solution, by about 2 orders of magnitude. It is unclear as to why this </w:t>
+      </w:r>
+      <w:r>
+        <w:t xml:space="preserve">bug is occurring. With more time it could surely be found, as it is most likely something small such as an improper index or </w:t>
+      </w:r>
+      <w:r>
+        <w:t xml:space="preserve">a sign. Obviously, the </w:t>
+      </w:r>
+      <w:r>
+        <w:t xml:space="preserve">functional </w:t>
+      </w:r>
+      <w:r>
+        <w:t xml:space="preserve">correction will not work properly if the </w:t>
+      </w:r>
+      <w:r>
+        <w:t xml:space="preserve">higher order </w:t>
+      </w:r>
+      <w:r>
+        <w:t>discretization does not work, but the code for the functional correction was implemented. It is believed that with minimal error, the</w:t>
+      </w:r>
+      <w:r>
+        <w:t xml:space="preserve"> 4</w:t>
+      </w:r>
+      <w:r>
+        <w:rPr>
+          <w:vertAlign w:val="superscript"/>
+        </w:rPr>
+        <w:t>th</w:t>
+      </w:r>
+      <w:r>
+        <w:t xml:space="preserve"> order implementation could be fixed, and the functional correction should work. </w:t>
+      </w:r>
+    </w:p>
+    <w:p>
+      <w:pPr>
+        <w:spacing w:after="207"/>
+        <w:ind w:left="581"/>
+        <w:jc w:val="center"/>
+      </w:pPr>
+      <w:r>
+        <w:rPr>
+          <w:noProof/>
+        </w:rPr>
+        <w:lastRenderedPageBreak/>
+        <w:drawing>
+          <wp:inline distT="0" distB="0" distL="0" distR="0" wp14:anchorId="5ADD73A4" wp14:editId="64F94F30">
+            <wp:extent cx="5943600" cy="3667125"/>
+            <wp:effectExtent l="0" t="0" r="0" b="9525"/>
+            <wp:docPr id="9" name="Picture 9"/>
+            <wp:cNvGraphicFramePr>
+              <a:graphicFrameLocks xmlns:a="http://schemas.openxmlformats.org/drawingml/2006/main" noChangeAspect="1"/>
+            </wp:cNvGraphicFramePr>
+            <a:graphic xmlns:a="http://schemas.openxmlformats.org/drawingml/2006/main">
+              <a:graphicData uri="http://schemas.openxmlformats.org/drawingml/2006/picture">
+                <pic:pic xmlns:pic="http://schemas.openxmlformats.org/drawingml/2006/picture">
+                  <pic:nvPicPr>
+                    <pic:cNvPr id="0" name="Picture 2"/>
+                    <pic:cNvPicPr>
+                      <a:picLocks noChangeAspect="1" noChangeArrowheads="1"/>
+                    </pic:cNvPicPr>
+                  </pic:nvPicPr>
+                  <pic:blipFill>
+                    <a:blip r:embed="rId17">
+                      <a:extLst>
+                        <a:ext uri="{28A0092B-C50C-407E-A947-70E740481C1C}">
+                          <a14:useLocalDpi xmlns:a14="http://schemas.microsoft.com/office/drawing/2010/main" val="0"/>
+                        </a:ext>
+                      </a:extLst>
+                    </a:blip>
+                    <a:srcRect/>
+                    <a:stretch>
+                      <a:fillRect/>
+                    </a:stretch>
+                  </pic:blipFill>
+                  <pic:spPr bwMode="auto">
+                    <a:xfrm>
+                      <a:off x="0" y="0"/>
+                      <a:ext cx="5943600" cy="3667125"/>
+                    </a:xfrm>
+                    <a:prstGeom prst="rect">
+                      <a:avLst/>
+                    </a:prstGeom>
+                    <a:noFill/>
+                    <a:ln>
+                      <a:noFill/>
+                    </a:ln>
+                  </pic:spPr>
+                </pic:pic>
+              </a:graphicData>
+            </a:graphic>
+          </wp:inline>
+        </w:drawing>
+      </w:r>
+    </w:p>
+    <w:p>
+      <w:pPr>
         <w:numPr>
           <w:ilvl w:val="0"/>
           <w:numId w:val="1"/>
@@ -6805,8 +7176,8 @@
       <w:r>
         <w:rPr>
           <w:rFonts w:ascii="Calibri" w:eastAsia="Calibri" w:hAnsi="Calibri" w:cs="Calibri"/>
-          <w:sz w:val="37"/>
-          <w:vertAlign w:val="superscript"/>
+          <w:sz w:val="24"/>
+          <w:szCs w:val="14"/>
         </w:rPr>
         <w:t>π</w:t>
       </w:r>
@@ -6815,7 +7186,14 @@
           <w:rFonts w:ascii="Calibri" w:eastAsia="Calibri" w:hAnsi="Calibri" w:cs="Calibri"/>
           <w:i/>
         </w:rPr>
-        <w:t xml:space="preserve">x </w:t>
+        <w:t>x</w:t>
+      </w:r>
+      <w:r>
+        <w:rPr>
+          <w:rFonts w:ascii="Calibri" w:eastAsia="Calibri" w:hAnsi="Calibri" w:cs="Calibri"/>
+          <w:i/>
+        </w:rPr>
+        <w:t xml:space="preserve"> </w:t>
       </w:r>
       <w:r>
         <w:t xml:space="preserve">as a boundary condition at </w:t>
@@ -6856,6 +7234,7 @@
         </w:rPr>
         <w:t>= (</w:t>
       </w:r>
+      <w:proofErr w:type="spellStart"/>
       <w:r>
         <w:rPr>
           <w:rFonts w:ascii="Calibri" w:eastAsia="Calibri" w:hAnsi="Calibri" w:cs="Calibri"/>
@@ -6877,6 +7256,7 @@
         </w:rPr>
         <w:t>g</w:t>
       </w:r>
+      <w:proofErr w:type="spellEnd"/>
       <w:r>
         <w:rPr>
           <w:rFonts w:ascii="Cambria" w:eastAsia="Cambria" w:hAnsi="Cambria" w:cs="Cambria"/>
@@ -6896,6 +7276,7 @@
         </w:rPr>
         <w:t>+(</w:t>
       </w:r>
+      <w:proofErr w:type="spellStart"/>
       <w:r>
         <w:rPr>
           <w:rFonts w:ascii="Calibri" w:eastAsia="Calibri" w:hAnsi="Calibri" w:cs="Calibri"/>
@@ -6925,6 +7306,7 @@
         </w:rPr>
         <w:t>h</w:t>
       </w:r>
+      <w:proofErr w:type="spellEnd"/>
       <w:r>
         <w:rPr>
           <w:rFonts w:ascii="Cambria" w:eastAsia="Cambria" w:hAnsi="Cambria" w:cs="Cambria"/>
@@ -7058,6 +7440,7 @@
         </w:rPr>
         <w:t>−</w:t>
       </w:r>
+      <w:proofErr w:type="spellStart"/>
       <w:r>
         <w:rPr>
           <w:rFonts w:ascii="Calibri" w:eastAsia="Calibri" w:hAnsi="Calibri" w:cs="Calibri"/>
@@ -7071,7 +7454,16 @@
           <w:i/>
           <w:vertAlign w:val="subscript"/>
         </w:rPr>
-        <w:t xml:space="preserve">y </w:t>
+        <w:t>y</w:t>
+      </w:r>
+      <w:proofErr w:type="spellEnd"/>
+      <w:r>
+        <w:rPr>
+          <w:rFonts w:ascii="Calibri" w:eastAsia="Calibri" w:hAnsi="Calibri" w:cs="Calibri"/>
+          <w:i/>
+          <w:vertAlign w:val="subscript"/>
+        </w:rPr>
+        <w:t xml:space="preserve"> </w:t>
       </w:r>
       <w:r>
         <w:t>in this case.</w:t>
@@ -7228,6 +7620,7 @@
         </w:rPr>
         <w:t>+(</w:t>
       </w:r>
+      <w:proofErr w:type="spellStart"/>
       <w:r>
         <w:rPr>
           <w:rFonts w:ascii="Calibri" w:eastAsia="Calibri" w:hAnsi="Calibri" w:cs="Calibri"/>
@@ -7257,6 +7650,7 @@
         </w:rPr>
         <w:t>e</w:t>
       </w:r>
+      <w:proofErr w:type="spellEnd"/>
       <w:r>
         <w:rPr>
           <w:rFonts w:ascii="Cambria" w:eastAsia="Cambria" w:hAnsi="Cambria" w:cs="Cambria"/>
@@ -7297,8 +7691,6 @@
       <w:r>
         <w:rPr>
           <w:rFonts w:ascii="Calibri" w:eastAsia="Calibri" w:hAnsi="Calibri" w:cs="Calibri"/>
-          <w:sz w:val="37"/>
-          <w:vertAlign w:val="superscript"/>
         </w:rPr>
         <w:t>π</w:t>
       </w:r>
@@ -7335,8 +7727,174 @@
         <w:ind w:left="581"/>
       </w:pPr>
       <w:r>
+        <w:t>Compute this functional using both the primal and dual problems, and show that this formulation is adjoint consistent and converges with the correct order of accuracy.</w:t>
+      </w:r>
+    </w:p>
+    <w:p>
+      <w:pPr>
+        <w:spacing w:after="221"/>
+        <w:ind w:left="581"/>
+      </w:pPr>
+      <w:r>
+        <w:t xml:space="preserve">To begin this problem, the first step is to </w:t>
+      </w:r>
+      <w:r>
+        <w:t>ensure the correct boundary conditions. In order to do this, a .</w:t>
+      </w:r>
+      <w:proofErr w:type="spellStart"/>
+      <w:r>
+        <w:t>vtk</w:t>
+      </w:r>
+      <w:proofErr w:type="spellEnd"/>
+      <w:r>
+        <w:t xml:space="preserve"> file was saved for both </w:t>
+      </w:r>
+      <w:r>
+        <w:t xml:space="preserve">u and g. This was then imported into Paraview, where the “Plot </w:t>
+      </w:r>
+      <w:r>
         <w:lastRenderedPageBreak/>
-        <w:t>Compute this functional using both the primal and dual problems, and show that this formulation is adjoint consistent and converges with the correct order of accuracy.</w:t>
+        <w:t xml:space="preserve">Over Line” </w:t>
+      </w:r>
+      <w:r>
+        <w:t>filter was applied to obtain the data at the boundary of interest. The following plots show that the boundary conditions were properly applied.</w:t>
+      </w:r>
+    </w:p>
+    <w:p>
+      <w:pPr>
+        <w:spacing w:after="221"/>
+        <w:ind w:left="581"/>
+        <w:jc w:val="center"/>
+      </w:pPr>
+      <w:r>
+        <w:rPr>
+          <w:noProof/>
+        </w:rPr>
+        <w:drawing>
+          <wp:inline distT="0" distB="0" distL="0" distR="0" wp14:anchorId="311CD51F" wp14:editId="6ED734D4">
+            <wp:extent cx="5848350" cy="4386262"/>
+            <wp:effectExtent l="0" t="0" r="0" b="0"/>
+            <wp:docPr id="10" name="Picture 10"/>
+            <wp:cNvGraphicFramePr>
+              <a:graphicFrameLocks xmlns:a="http://schemas.openxmlformats.org/drawingml/2006/main" noChangeAspect="1"/>
+            </wp:cNvGraphicFramePr>
+            <a:graphic xmlns:a="http://schemas.openxmlformats.org/drawingml/2006/main">
+              <a:graphicData uri="http://schemas.openxmlformats.org/drawingml/2006/picture">
+                <pic:pic xmlns:pic="http://schemas.openxmlformats.org/drawingml/2006/picture">
+                  <pic:nvPicPr>
+                    <pic:cNvPr id="10" name="Picture 10"/>
+                    <pic:cNvPicPr>
+                      <a:picLocks noChangeAspect="1" noChangeArrowheads="1"/>
+                    </pic:cNvPicPr>
+                  </pic:nvPicPr>
+                  <pic:blipFill>
+                    <a:blip r:embed="rId18">
+                      <a:extLst>
+                        <a:ext uri="{28A0092B-C50C-407E-A947-70E740481C1C}">
+                          <a14:useLocalDpi xmlns:a14="http://schemas.microsoft.com/office/drawing/2010/main" val="0"/>
+                        </a:ext>
+                      </a:extLst>
+                    </a:blip>
+                    <a:stretch>
+                      <a:fillRect/>
+                    </a:stretch>
+                  </pic:blipFill>
+                  <pic:spPr bwMode="auto">
+                    <a:xfrm>
+                      <a:off x="0" y="0"/>
+                      <a:ext cx="5848350" cy="4386262"/>
+                    </a:xfrm>
+                    <a:prstGeom prst="rect">
+                      <a:avLst/>
+                    </a:prstGeom>
+                    <a:noFill/>
+                    <a:ln>
+                      <a:noFill/>
+                    </a:ln>
+                  </pic:spPr>
+                </pic:pic>
+              </a:graphicData>
+            </a:graphic>
+          </wp:inline>
+        </w:drawing>
+      </w:r>
+    </w:p>
+    <w:p>
+      <w:pPr>
+        <w:spacing w:after="221"/>
+        <w:ind w:left="581"/>
+      </w:pPr>
+      <w:r>
+        <w:rPr>
+          <w:noProof/>
+        </w:rPr>
+        <w:lastRenderedPageBreak/>
+        <w:drawing>
+          <wp:inline distT="0" distB="0" distL="0" distR="0" wp14:anchorId="552EC4E1" wp14:editId="771C9687">
+            <wp:extent cx="5848350" cy="4391025"/>
+            <wp:effectExtent l="0" t="0" r="0" b="9525"/>
+            <wp:docPr id="11" name="Picture 11"/>
+            <wp:cNvGraphicFramePr>
+              <a:graphicFrameLocks xmlns:a="http://schemas.openxmlformats.org/drawingml/2006/main" noChangeAspect="1"/>
+            </wp:cNvGraphicFramePr>
+            <a:graphic xmlns:a="http://schemas.openxmlformats.org/drawingml/2006/main">
+              <a:graphicData uri="http://schemas.openxmlformats.org/drawingml/2006/picture">
+                <pic:pic xmlns:pic="http://schemas.openxmlformats.org/drawingml/2006/picture">
+                  <pic:nvPicPr>
+                    <pic:cNvPr id="0" name="Picture 4"/>
+                    <pic:cNvPicPr>
+                      <a:picLocks noChangeAspect="1" noChangeArrowheads="1"/>
+                    </pic:cNvPicPr>
+                  </pic:nvPicPr>
+                  <pic:blipFill>
+                    <a:blip r:embed="rId19">
+                      <a:extLst>
+                        <a:ext uri="{28A0092B-C50C-407E-A947-70E740481C1C}">
+                          <a14:useLocalDpi xmlns:a14="http://schemas.microsoft.com/office/drawing/2010/main" val="0"/>
+                        </a:ext>
+                      </a:extLst>
+                    </a:blip>
+                    <a:srcRect/>
+                    <a:stretch>
+                      <a:fillRect/>
+                    </a:stretch>
+                  </pic:blipFill>
+                  <pic:spPr bwMode="auto">
+                    <a:xfrm>
+                      <a:off x="0" y="0"/>
+                      <a:ext cx="5848350" cy="4391025"/>
+                    </a:xfrm>
+                    <a:prstGeom prst="rect">
+                      <a:avLst/>
+                    </a:prstGeom>
+                    <a:noFill/>
+                    <a:ln>
+                      <a:noFill/>
+                    </a:ln>
+                  </pic:spPr>
+                </pic:pic>
+              </a:graphicData>
+            </a:graphic>
+          </wp:inline>
+        </w:drawing>
+      </w:r>
+    </w:p>
+    <w:p>
+      <w:pPr>
+        <w:spacing w:after="221"/>
+        <w:ind w:left="581"/>
+      </w:pPr>
+      <w:r>
+        <w:t xml:space="preserve">At the current time of writing I still have a bug </w:t>
+      </w:r>
+      <w:r>
+        <w:t>in</w:t>
+      </w:r>
+      <w:r>
+        <w:t xml:space="preserve"> the code for this section. I will submit everything as is, and try to solve it tomorrow. This way if I find the solution I can submit it tomorrow, otherwise I will not lose grades </w:t>
+      </w:r>
+      <w:r>
+        <w:t xml:space="preserve">by wasting time since I am out of days. </w:t>
       </w:r>
     </w:p>
     <w:p>
@@ -7405,7 +7963,7 @@
                     <pic:cNvPicPr/>
                   </pic:nvPicPr>
                   <pic:blipFill>
-                    <a:blip r:embed="rId14"/>
+                    <a:blip r:embed="rId20"/>
                     <a:stretch>
                       <a:fillRect/>
                     </a:stretch>
@@ -7459,7 +8017,7 @@
                     <pic:cNvPicPr/>
                   </pic:nvPicPr>
                   <pic:blipFill>
-                    <a:blip r:embed="rId15"/>
+                    <a:blip r:embed="rId21"/>
                     <a:stretch>
                       <a:fillRect/>
                     </a:stretch>
@@ -7532,6 +8090,7 @@
         </w:rPr>
         <w:t>= (</w:t>
       </w:r>
+      <w:proofErr w:type="spellStart"/>
       <w:r>
         <w:rPr>
           <w:rFonts w:ascii="Calibri" w:eastAsia="Calibri" w:hAnsi="Calibri" w:cs="Calibri"/>
@@ -7553,6 +8112,7 @@
         </w:rPr>
         <w:t>g</w:t>
       </w:r>
+      <w:proofErr w:type="spellEnd"/>
       <w:r>
         <w:rPr>
           <w:rFonts w:ascii="Cambria" w:eastAsia="Cambria" w:hAnsi="Cambria" w:cs="Cambria"/>
@@ -7717,7 +8277,7 @@
                     <pic:cNvPicPr/>
                   </pic:nvPicPr>
                   <pic:blipFill>
-                    <a:blip r:embed="rId16"/>
+                    <a:blip r:embed="rId22"/>
                     <a:stretch>
                       <a:fillRect/>
                     </a:stretch>
@@ -7761,7 +8321,7 @@
                     <pic:cNvPicPr/>
                   </pic:nvPicPr>
                   <pic:blipFill>
-                    <a:blip r:embed="rId17"/>
+                    <a:blip r:embed="rId23"/>
                     <a:stretch>
                       <a:fillRect/>
                     </a:stretch>
@@ -7812,7 +8372,7 @@
                     <pic:cNvPicPr/>
                   </pic:nvPicPr>
                   <pic:blipFill>
-                    <a:blip r:embed="rId17"/>
+                    <a:blip r:embed="rId23"/>
                     <a:stretch>
                       <a:fillRect/>
                     </a:stretch>
@@ -7900,7 +8460,12 @@
         <w:ind w:left="581"/>
       </w:pPr>
       <w:r>
-        <w:t>This would require an additional primal solve to estimate the derivative of the solution with respect to each component</w:t>
+        <w:lastRenderedPageBreak/>
+        <w:t xml:space="preserve">This would require an additional primal solve to estimate the derivative of the solution with respect to each </w:t>
+      </w:r>
+      <w:proofErr w:type="spellStart"/>
+      <w:r>
+        <w:t>component</w:t>
       </w:r>
       <w:r>
         <w:rPr>
@@ -7916,6 +8481,7 @@
         </w:rPr>
         <w:t>c</w:t>
       </w:r>
+      <w:proofErr w:type="spellEnd"/>
       <w:r>
         <w:t>. But we can take advantage of the zero-residual condition:</w:t>
       </w:r>
@@ -8004,7 +8570,7 @@
                     <pic:cNvPicPr/>
                   </pic:nvPicPr>
                   <pic:blipFill>
-                    <a:blip r:embed="rId18"/>
+                    <a:blip r:embed="rId24"/>
                     <a:stretch>
                       <a:fillRect/>
                     </a:stretch>
@@ -8070,7 +8636,7 @@
                     <pic:cNvPicPr/>
                   </pic:nvPicPr>
                   <pic:blipFill>
-                    <a:blip r:embed="rId19"/>
+                    <a:blip r:embed="rId25"/>
                     <a:stretch>
                       <a:fillRect/>
                     </a:stretch>
@@ -8123,7 +8689,7 @@
                     <pic:cNvPicPr/>
                   </pic:nvPicPr>
                   <pic:blipFill>
-                    <a:blip r:embed="rId20"/>
+                    <a:blip r:embed="rId26"/>
                     <a:stretch>
                       <a:fillRect/>
                     </a:stretch>
@@ -8178,7 +8744,7 @@
                     <pic:cNvPicPr/>
                   </pic:nvPicPr>
                   <pic:blipFill>
-                    <a:blip r:embed="rId21"/>
+                    <a:blip r:embed="rId27"/>
                     <a:stretch>
                       <a:fillRect/>
                     </a:stretch>
@@ -9108,6 +9674,564 @@
 </w:styles>
 </file>
 
+<file path=word/glossary/document.xml><?xml version="1.0" encoding="utf-8"?>
+<w:glossaryDocument xmlns:wpc="http://schemas.microsoft.com/office/word/2010/wordprocessingCanvas" xmlns:cx="http://schemas.microsoft.com/office/drawing/2014/chartex" xmlns:cx1="http://schemas.microsoft.com/office/drawing/2015/9/8/chartex" xmlns:cx2="http://schemas.microsoft.com/office/drawing/2015/10/21/chartex" xmlns:cx3="http://schemas.microsoft.com/office/drawing/2016/5/9/chartex" xmlns:cx4="http://schemas.microsoft.com/office/drawing/2016/5/10/chartex" xmlns:cx5="http://schemas.microsoft.com/office/drawing/2016/5/11/chartex" xmlns:cx6="http://schemas.microsoft.com/office/drawing/2016/5/12/chartex" xmlns:cx7="http://schemas.microsoft.com/office/drawing/2016/5/13/chartex" xmlns:cx8="http://schemas.microsoft.com/office/drawing/2016/5/14/chartex" xmlns:mc="http://schemas.openxmlformats.org/markup-compatibility/2006" xmlns:aink="http://schemas.microsoft.com/office/drawing/2016/ink" xmlns:am3d="http://schemas.microsoft.com/office/drawing/2017/model3d" xmlns:o="urn:schemas-microsoft-com:office:office" xmlns:oel="http://schemas.microsoft.com/office/2019/extlst" xmlns:r="http://schemas.openxmlformats.org/officeDocument/2006/relationships" xmlns:m="http://schemas.openxmlformats.org/officeDocument/2006/math" xmlns:v="urn:schemas-microsoft-com:vml" xmlns:wp14="http://schemas.microsoft.com/office/word/2010/wordprocessingDrawing" xmlns:wp="http://schemas.openxmlformats.org/drawingml/2006/wordprocessingDrawing" xmlns:w10="urn:schemas-microsoft-com:office:word" xmlns:w="http://schemas.openxmlformats.org/wordprocessingml/2006/main" xmlns:w14="http://schemas.microsoft.com/office/word/2010/wordml" xmlns:w15="http://schemas.microsoft.com/office/word/2012/wordml" xmlns:w16cex="http://schemas.microsoft.com/office/word/2018/wordml/cex" xmlns:w16cid="http://schemas.microsoft.com/office/word/2016/wordml/cid" xmlns:w16="http://schemas.microsoft.com/office/word/2018/wordml" xmlns:w16du="http://schemas.microsoft.com/office/word/2023/wordml/word16du" xmlns:w16sdtdh="http://schemas.microsoft.com/office/word/2020/wordml/sdtdatahash" xmlns:w16se="http://schemas.microsoft.com/office/word/2015/wordml/symex" xmlns:wpg="http://schemas.microsoft.com/office/word/2010/wordprocessingGroup" xmlns:wpi="http://schemas.microsoft.com/office/word/2010/wordprocessingInk" xmlns:wne="http://schemas.microsoft.com/office/word/2006/wordml" xmlns:wps="http://schemas.microsoft.com/office/word/2010/wordprocessingShape" mc:Ignorable="w14 w15 w16se w16cid w16 w16cex w16sdtdh wp14">
+  <w:docParts>
+    <w:docPart>
+      <w:docPartPr>
+        <w:name w:val="DefaultPlaceholder_-1854013440"/>
+        <w:category>
+          <w:name w:val="General"/>
+          <w:gallery w:val="placeholder"/>
+        </w:category>
+        <w:types>
+          <w:type w:val="bbPlcHdr"/>
+        </w:types>
+        <w:behaviors>
+          <w:behavior w:val="content"/>
+        </w:behaviors>
+        <w:guid w:val="{DD5F0EAD-2965-4E4E-95B8-8C5317ED0B08}"/>
+      </w:docPartPr>
+      <w:docPartBody>
+        <w:p>
+          <w:r>
+            <w:rPr>
+              <w:rStyle w:val="PlaceholderText"/>
+            </w:rPr>
+            <w:t>Click or tap here to enter text.</w:t>
+          </w:r>
+        </w:p>
+      </w:docPartBody>
+    </w:docPart>
+  </w:docParts>
+</w:glossaryDocument>
+</file>
+
+<file path=word/glossary/fontTable.xml><?xml version="1.0" encoding="utf-8"?>
+<w:fonts xmlns:mc="http://schemas.openxmlformats.org/markup-compatibility/2006" xmlns:r="http://schemas.openxmlformats.org/officeDocument/2006/relationships" xmlns:w="http://schemas.openxmlformats.org/wordprocessingml/2006/main" xmlns:w14="http://schemas.microsoft.com/office/word/2010/wordml" xmlns:w15="http://schemas.microsoft.com/office/word/2012/wordml" xmlns:w16cex="http://schemas.microsoft.com/office/word/2018/wordml/cex" xmlns:w16cid="http://schemas.microsoft.com/office/word/2016/wordml/cid" xmlns:w16="http://schemas.microsoft.com/office/word/2018/wordml" xmlns:w16sdtdh="http://schemas.microsoft.com/office/word/2020/wordml/sdtdatahash" xmlns:w16se="http://schemas.microsoft.com/office/word/2015/wordml/symex" mc:Ignorable="w14 w15 w16se w16cid w16 w16cex w16sdtdh">
+  <w:font w:name="Times New Roman">
+    <w:panose1 w:val="02020603050405020304"/>
+    <w:charset w:val="00"/>
+    <w:family w:val="roman"/>
+    <w:pitch w:val="variable"/>
+    <w:sig w:usb0="E0002EFF" w:usb1="C000785B" w:usb2="00000009" w:usb3="00000000" w:csb0="000001FF" w:csb1="00000000"/>
+  </w:font>
+  <w:font w:name="Calibri">
+    <w:panose1 w:val="020F0502020204030204"/>
+    <w:charset w:val="00"/>
+    <w:family w:val="swiss"/>
+    <w:pitch w:val="variable"/>
+    <w:sig w:usb0="E4002EFF" w:usb1="C000247B" w:usb2="00000009" w:usb3="00000000" w:csb0="000001FF" w:csb1="00000000"/>
+  </w:font>
+  <w:font w:name="Cambria">
+    <w:panose1 w:val="02040503050406030204"/>
+    <w:charset w:val="00"/>
+    <w:family w:val="roman"/>
+    <w:pitch w:val="variable"/>
+    <w:sig w:usb0="E00006FF" w:usb1="420024FF" w:usb2="02000000" w:usb3="00000000" w:csb0="0000019F" w:csb1="00000000"/>
+  </w:font>
+  <w:font w:name="Cambria Math">
+    <w:panose1 w:val="02040503050406030204"/>
+    <w:charset w:val="00"/>
+    <w:family w:val="roman"/>
+    <w:pitch w:val="variable"/>
+    <w:sig w:usb0="E00006FF" w:usb1="420024FF" w:usb2="02000000" w:usb3="00000000" w:csb0="0000019F" w:csb1="00000000"/>
+  </w:font>
+  <w:font w:name="Calibri Light">
+    <w:panose1 w:val="020F0302020204030204"/>
+    <w:charset w:val="00"/>
+    <w:family w:val="swiss"/>
+    <w:pitch w:val="variable"/>
+    <w:sig w:usb0="E4002EFF" w:usb1="C000247B" w:usb2="00000009" w:usb3="00000000" w:csb0="000001FF" w:csb1="00000000"/>
+  </w:font>
+</w:fonts>
+</file>
+
+<file path=word/glossary/settings.xml><?xml version="1.0" encoding="utf-8"?>
+<w:settings xmlns:mc="http://schemas.openxmlformats.org/markup-compatibility/2006" xmlns:o="urn:schemas-microsoft-com:office:office" xmlns:r="http://schemas.openxmlformats.org/officeDocument/2006/relationships" xmlns:m="http://schemas.openxmlformats.org/officeDocument/2006/math" xmlns:v="urn:schemas-microsoft-com:vml" xmlns:w10="urn:schemas-microsoft-com:office:word" xmlns:w="http://schemas.openxmlformats.org/wordprocessingml/2006/main" xmlns:w14="http://schemas.microsoft.com/office/word/2010/wordml" xmlns:w15="http://schemas.microsoft.com/office/word/2012/wordml" xmlns:w16cex="http://schemas.microsoft.com/office/word/2018/wordml/cex" xmlns:w16cid="http://schemas.microsoft.com/office/word/2016/wordml/cid" xmlns:w16="http://schemas.microsoft.com/office/word/2018/wordml" xmlns:w16sdtdh="http://schemas.microsoft.com/office/word/2020/wordml/sdtdatahash" xmlns:w16se="http://schemas.microsoft.com/office/word/2015/wordml/symex" xmlns:sl="http://schemas.openxmlformats.org/schemaLibrary/2006/main" mc:Ignorable="w14 w15 w16se w16cid w16 w16cex w16sdtdh">
+  <w:view w:val="normal"/>
+  <w:defaultTabStop w:val="720"/>
+  <w:characterSpacingControl w:val="doNotCompress"/>
+  <w:compat>
+    <w:useFELayout/>
+    <w:compatSetting w:name="compatibilityMode" w:uri="http://schemas.microsoft.com/office/word" w:val="15"/>
+    <w:compatSetting w:name="overrideTableStyleFontSizeAndJustification" w:uri="http://schemas.microsoft.com/office/word" w:val="1"/>
+    <w:compatSetting w:name="enableOpenTypeFeatures" w:uri="http://schemas.microsoft.com/office/word" w:val="1"/>
+    <w:compatSetting w:name="doNotFlipMirrorIndents" w:uri="http://schemas.microsoft.com/office/word" w:val="1"/>
+    <w:compatSetting w:name="differentiateMultirowTableHeaders" w:uri="http://schemas.microsoft.com/office/word" w:val="1"/>
+    <w:compatSetting w:name="useWord2013TrackBottomHyphenation" w:uri="http://schemas.microsoft.com/office/word" w:val="0"/>
+  </w:compat>
+  <w:rsids>
+    <w:rsidRoot w:val="00D87788"/>
+    <w:rsid w:val="00D87788"/>
+  </w:rsids>
+  <m:mathPr>
+    <m:mathFont m:val="Cambria Math"/>
+    <m:brkBin m:val="before"/>
+    <m:brkBinSub m:val="--"/>
+    <m:smallFrac m:val="0"/>
+    <m:dispDef/>
+    <m:lMargin m:val="0"/>
+    <m:rMargin m:val="0"/>
+    <m:defJc m:val="centerGroup"/>
+    <m:wrapIndent m:val="1440"/>
+    <m:intLim m:val="subSup"/>
+    <m:naryLim m:val="undOvr"/>
+  </m:mathPr>
+  <w:themeFontLang w:val="en-CA"/>
+  <w:clrSchemeMapping w:bg1="light1" w:t1="dark1" w:bg2="light2" w:t2="dark2" w:accent1="accent1" w:accent2="accent2" w:accent3="accent3" w:accent4="accent4" w:accent5="accent5" w:accent6="accent6" w:hyperlink="hyperlink" w:followedHyperlink="followedHyperlink"/>
+  <w:decimalSymbol w:val="."/>
+  <w:listSeparator w:val=","/>
+  <w15:chartTrackingRefBased/>
+</w:settings>
+</file>
+
+<file path=word/glossary/styles.xml><?xml version="1.0" encoding="utf-8"?>
+<w:styles xmlns:mc="http://schemas.openxmlformats.org/markup-compatibility/2006" xmlns:r="http://schemas.openxmlformats.org/officeDocument/2006/relationships" xmlns:w="http://schemas.openxmlformats.org/wordprocessingml/2006/main" xmlns:w14="http://schemas.microsoft.com/office/word/2010/wordml" xmlns:w15="http://schemas.microsoft.com/office/word/2012/wordml" xmlns:w16cex="http://schemas.microsoft.com/office/word/2018/wordml/cex" xmlns:w16cid="http://schemas.microsoft.com/office/word/2016/wordml/cid" xmlns:w16="http://schemas.microsoft.com/office/word/2018/wordml" xmlns:w16sdtdh="http://schemas.microsoft.com/office/word/2020/wordml/sdtdatahash" xmlns:w16se="http://schemas.microsoft.com/office/word/2015/wordml/symex" mc:Ignorable="w14 w15 w16se w16cid w16 w16cex w16sdtdh">
+  <w:docDefaults>
+    <w:rPrDefault>
+      <w:rPr>
+        <w:rFonts w:asciiTheme="minorHAnsi" w:eastAsiaTheme="minorEastAsia" w:hAnsiTheme="minorHAnsi" w:cstheme="minorBidi"/>
+        <w:sz w:val="22"/>
+        <w:szCs w:val="22"/>
+        <w:lang w:val="en-CA" w:eastAsia="en-CA" w:bidi="ar-SA"/>
+      </w:rPr>
+    </w:rPrDefault>
+    <w:pPrDefault>
+      <w:pPr>
+        <w:spacing w:after="160" w:line="259" w:lineRule="auto"/>
+      </w:pPr>
+    </w:pPrDefault>
+  </w:docDefaults>
+  <w:latentStyles w:defLockedState="0" w:defUIPriority="99" w:defSemiHidden="0" w:defUnhideWhenUsed="0" w:defQFormat="0" w:count="376">
+    <w:lsdException w:name="Normal" w:uiPriority="0" w:qFormat="1"/>
+    <w:lsdException w:name="heading 1" w:uiPriority="9" w:qFormat="1"/>
+    <w:lsdException w:name="heading 2" w:semiHidden="1" w:uiPriority="9" w:unhideWhenUsed="1" w:qFormat="1"/>
+    <w:lsdException w:name="heading 3" w:semiHidden="1" w:uiPriority="9" w:unhideWhenUsed="1" w:qFormat="1"/>
+    <w:lsdException w:name="heading 4" w:semiHidden="1" w:uiPriority="9" w:unhideWhenUsed="1" w:qFormat="1"/>
+    <w:lsdException w:name="heading 5" w:semiHidden="1" w:uiPriority="9" w:unhideWhenUsed="1" w:qFormat="1"/>
+    <w:lsdException w:name="heading 6" w:semiHidden="1" w:uiPriority="9" w:unhideWhenUsed="1" w:qFormat="1"/>
+    <w:lsdException w:name="heading 7" w:semiHidden="1" w:uiPriority="9" w:unhideWhenUsed="1" w:qFormat="1"/>
+    <w:lsdException w:name="heading 8" w:semiHidden="1" w:uiPriority="9" w:unhideWhenUsed="1" w:qFormat="1"/>
+    <w:lsdException w:name="heading 9" w:semiHidden="1" w:uiPriority="9" w:unhideWhenUsed="1" w:qFormat="1"/>
+    <w:lsdException w:name="index 1" w:semiHidden="1" w:unhideWhenUsed="1"/>
+    <w:lsdException w:name="index 2" w:semiHidden="1" w:unhideWhenUsed="1"/>
+    <w:lsdException w:name="index 3" w:semiHidden="1" w:unhideWhenUsed="1"/>
+    <w:lsdException w:name="index 4" w:semiHidden="1" w:unhideWhenUsed="1"/>
+    <w:lsdException w:name="index 5" w:semiHidden="1" w:unhideWhenUsed="1"/>
+    <w:lsdException w:name="index 6" w:semiHidden="1" w:unhideWhenUsed="1"/>
+    <w:lsdException w:name="index 7" w:semiHidden="1" w:unhideWhenUsed="1"/>
+    <w:lsdException w:name="index 8" w:semiHidden="1" w:unhideWhenUsed="1"/>
+    <w:lsdException w:name="index 9" w:semiHidden="1" w:unhideWhenUsed="1"/>
+    <w:lsdException w:name="toc 1" w:semiHidden="1" w:uiPriority="39" w:unhideWhenUsed="1"/>
+    <w:lsdException w:name="toc 2" w:semiHidden="1" w:uiPriority="39" w:unhideWhenUsed="1"/>
+    <w:lsdException w:name="toc 3" w:semiHidden="1" w:uiPriority="39" w:unhideWhenUsed="1"/>
+    <w:lsdException w:name="toc 4" w:semiHidden="1" w:uiPriority="39" w:unhideWhenUsed="1"/>
+    <w:lsdException w:name="toc 5" w:semiHidden="1" w:uiPriority="39" w:unhideWhenUsed="1"/>
+    <w:lsdException w:name="toc 6" w:semiHidden="1" w:uiPriority="39" w:unhideWhenUsed="1"/>
+    <w:lsdException w:name="toc 7" w:semiHidden="1" w:uiPriority="39" w:unhideWhenUsed="1"/>
+    <w:lsdException w:name="toc 8" w:semiHidden="1" w:uiPriority="39" w:unhideWhenUsed="1"/>
+    <w:lsdException w:name="toc 9" w:semiHidden="1" w:uiPriority="39" w:unhideWhenUsed="1"/>
+    <w:lsdException w:name="Normal Indent" w:semiHidden="1" w:unhideWhenUsed="1"/>
+    <w:lsdException w:name="footnote text" w:semiHidden="1" w:unhideWhenUsed="1"/>
+    <w:lsdException w:name="annotation text" w:semiHidden="1" w:unhideWhenUsed="1"/>
+    <w:lsdException w:name="header" w:semiHidden="1" w:unhideWhenUsed="1"/>
+    <w:lsdException w:name="footer" w:semiHidden="1" w:unhideWhenUsed="1"/>
+    <w:lsdException w:name="index heading" w:semiHidden="1" w:unhideWhenUsed="1"/>
+    <w:lsdException w:name="caption" w:semiHidden="1" w:uiPriority="35" w:unhideWhenUsed="1" w:qFormat="1"/>
+    <w:lsdException w:name="table of figures" w:semiHidden="1" w:unhideWhenUsed="1"/>
+    <w:lsdException w:name="envelope address" w:semiHidden="1" w:unhideWhenUsed="1"/>
+    <w:lsdException w:name="envelope return" w:semiHidden="1" w:unhideWhenUsed="1"/>
+    <w:lsdException w:name="footnote reference" w:semiHidden="1" w:unhideWhenUsed="1"/>
+    <w:lsdException w:name="annotation reference" w:semiHidden="1" w:unhideWhenUsed="1"/>
+    <w:lsdException w:name="line number" w:semiHidden="1" w:unhideWhenUsed="1"/>
+    <w:lsdException w:name="page number" w:semiHidden="1" w:unhideWhenUsed="1"/>
+    <w:lsdException w:name="endnote reference" w:semiHidden="1" w:unhideWhenUsed="1"/>
+    <w:lsdException w:name="endnote text" w:semiHidden="1" w:unhideWhenUsed="1"/>
+    <w:lsdException w:name="table of authorities" w:semiHidden="1" w:unhideWhenUsed="1"/>
+    <w:lsdException w:name="macro" w:semiHidden="1" w:unhideWhenUsed="1"/>
+    <w:lsdException w:name="toa heading" w:semiHidden="1" w:unhideWhenUsed="1"/>
+    <w:lsdException w:name="List" w:semiHidden="1" w:unhideWhenUsed="1"/>
+    <w:lsdException w:name="List Bullet" w:semiHidden="1" w:unhideWhenUsed="1"/>
+    <w:lsdException w:name="List Number" w:semiHidden="1" w:unhideWhenUsed="1"/>
+    <w:lsdException w:name="List 2" w:semiHidden="1" w:unhideWhenUsed="1"/>
+    <w:lsdException w:name="List 3" w:semiHidden="1" w:unhideWhenUsed="1"/>
+    <w:lsdException w:name="List 4" w:semiHidden="1" w:unhideWhenUsed="1"/>
+    <w:lsdException w:name="List 5" w:semiHidden="1" w:unhideWhenUsed="1"/>
+    <w:lsdException w:name="List Bullet 2" w:semiHidden="1" w:unhideWhenUsed="1"/>
+    <w:lsdException w:name="List Bullet 3" w:semiHidden="1" w:unhideWhenUsed="1"/>
+    <w:lsdException w:name="List Bullet 4" w:semiHidden="1" w:unhideWhenUsed="1"/>
+    <w:lsdException w:name="List Bullet 5" w:semiHidden="1" w:unhideWhenUsed="1"/>
+    <w:lsdException w:name="List Number 2" w:semiHidden="1" w:unhideWhenUsed="1"/>
+    <w:lsdException w:name="List Number 3" w:semiHidden="1" w:unhideWhenUsed="1"/>
+    <w:lsdException w:name="List Number 4" w:semiHidden="1" w:unhideWhenUsed="1"/>
+    <w:lsdException w:name="List Number 5" w:semiHidden="1" w:unhideWhenUsed="1"/>
+    <w:lsdException w:name="Title" w:uiPriority="10" w:qFormat="1"/>
+    <w:lsdException w:name="Closing" w:semiHidden="1" w:unhideWhenUsed="1"/>
+    <w:lsdException w:name="Signature" w:semiHidden="1" w:unhideWhenUsed="1"/>
+    <w:lsdException w:name="Default Paragraph Font" w:semiHidden="1" w:uiPriority="1" w:unhideWhenUsed="1"/>
+    <w:lsdException w:name="Body Text" w:semiHidden="1" w:unhideWhenUsed="1"/>
+    <w:lsdException w:name="Body Text Indent" w:semiHidden="1" w:unhideWhenUsed="1"/>
+    <w:lsdException w:name="List Continue" w:semiHidden="1" w:unhideWhenUsed="1"/>
+    <w:lsdException w:name="List Continue 2" w:semiHidden="1" w:unhideWhenUsed="1"/>
+    <w:lsdException w:name="List Continue 3" w:semiHidden="1" w:unhideWhenUsed="1"/>
+    <w:lsdException w:name="List Continue 4" w:semiHidden="1" w:unhideWhenUsed="1"/>
+    <w:lsdException w:name="List Continue 5" w:semiHidden="1" w:unhideWhenUsed="1"/>
+    <w:lsdException w:name="Message Header" w:semiHidden="1" w:unhideWhenUsed="1"/>
+    <w:lsdException w:name="Subtitle" w:uiPriority="11" w:qFormat="1"/>
+    <w:lsdException w:name="Salutation" w:semiHidden="1" w:unhideWhenUsed="1"/>
+    <w:lsdException w:name="Date" w:semiHidden="1" w:unhideWhenUsed="1"/>
+    <w:lsdException w:name="Body Text First Indent" w:semiHidden="1" w:unhideWhenUsed="1"/>
+    <w:lsdException w:name="Body Text First Indent 2" w:semiHidden="1" w:unhideWhenUsed="1"/>
+    <w:lsdException w:name="Note Heading" w:semiHidden="1" w:unhideWhenUsed="1"/>
+    <w:lsdException w:name="Body Text 2" w:semiHidden="1" w:unhideWhenUsed="1"/>
+    <w:lsdException w:name="Body Text 3" w:semiHidden="1" w:unhideWhenUsed="1"/>
+    <w:lsdException w:name="Body Text Indent 2" w:semiHidden="1" w:unhideWhenUsed="1"/>
+    <w:lsdException w:name="Body Text Indent 3" w:semiHidden="1" w:unhideWhenUsed="1"/>
+    <w:lsdException w:name="Block Text" w:semiHidden="1" w:unhideWhenUsed="1"/>
+    <w:lsdException w:name="Hyperlink" w:semiHidden="1" w:unhideWhenUsed="1"/>
+    <w:lsdException w:name="FollowedHyperlink" w:semiHidden="1" w:unhideWhenUsed="1"/>
+    <w:lsdException w:name="Strong" w:uiPriority="22" w:qFormat="1"/>
+    <w:lsdException w:name="Emphasis" w:uiPriority="20" w:qFormat="1"/>
+    <w:lsdException w:name="Document Map" w:semiHidden="1" w:unhideWhenUsed="1"/>
+    <w:lsdException w:name="Plain Text" w:semiHidden="1" w:unhideWhenUsed="1"/>
+    <w:lsdException w:name="E-mail Signature" w:semiHidden="1" w:unhideWhenUsed="1"/>
+    <w:lsdException w:name="HTML Top of Form" w:semiHidden="1" w:unhideWhenUsed="1"/>
+    <w:lsdException w:name="HTML Bottom of Form" w:semiHidden="1" w:unhideWhenUsed="1"/>
+    <w:lsdException w:name="Normal (Web)" w:semiHidden="1" w:unhideWhenUsed="1"/>
+    <w:lsdException w:name="HTML Acronym" w:semiHidden="1" w:unhideWhenUsed="1"/>
+    <w:lsdException w:name="HTML Address" w:semiHidden="1" w:unhideWhenUsed="1"/>
+    <w:lsdException w:name="HTML Cite" w:semiHidden="1" w:unhideWhenUsed="1"/>
+    <w:lsdException w:name="HTML Code" w:semiHidden="1" w:unhideWhenUsed="1"/>
+    <w:lsdException w:name="HTML Definition" w:semiHidden="1" w:unhideWhenUsed="1"/>
+    <w:lsdException w:name="HTML Keyboard" w:semiHidden="1" w:unhideWhenUsed="1"/>
+    <w:lsdException w:name="HTML Preformatted" w:semiHidden="1" w:unhideWhenUsed="1"/>
+    <w:lsdException w:name="HTML Sample" w:semiHidden="1" w:unhideWhenUsed="1"/>
+    <w:lsdException w:name="HTML Typewriter" w:semiHidden="1" w:unhideWhenUsed="1"/>
+    <w:lsdException w:name="HTML Variable" w:semiHidden="1" w:unhideWhenUsed="1"/>
+    <w:lsdException w:name="Normal Table" w:semiHidden="1" w:unhideWhenUsed="1"/>
+    <w:lsdException w:name="annotation subject" w:semiHidden="1" w:unhideWhenUsed="1"/>
+    <w:lsdException w:name="No List" w:semiHidden="1" w:unhideWhenUsed="1"/>
+    <w:lsdException w:name="Outline List 1" w:semiHidden="1" w:unhideWhenUsed="1"/>
+    <w:lsdException w:name="Outline List 2" w:semiHidden="1" w:unhideWhenUsed="1"/>
+    <w:lsdException w:name="Outline List 3" w:semiHidden="1" w:unhideWhenUsed="1"/>
+    <w:lsdException w:name="Table Simple 1" w:semiHidden="1" w:unhideWhenUsed="1"/>
+    <w:lsdException w:name="Table Simple 2" w:semiHidden="1" w:unhideWhenUsed="1"/>
+    <w:lsdException w:name="Table Simple 3" w:semiHidden="1" w:unhideWhenUsed="1"/>
+    <w:lsdException w:name="Table Classic 1" w:semiHidden="1" w:unhideWhenUsed="1"/>
+    <w:lsdException w:name="Table Classic 2" w:semiHidden="1" w:unhideWhenUsed="1"/>
+    <w:lsdException w:name="Table Classic 3" w:semiHidden="1" w:unhideWhenUsed="1"/>
+    <w:lsdException w:name="Table Classic 4" w:semiHidden="1" w:unhideWhenUsed="1"/>
+    <w:lsdException w:name="Table Colorful 1" w:semiHidden="1" w:unhideWhenUsed="1"/>
+    <w:lsdException w:name="Table Colorful 2" w:semiHidden="1" w:unhideWhenUsed="1"/>
+    <w:lsdException w:name="Table Colorful 3" w:semiHidden="1" w:unhideWhenUsed="1"/>
+    <w:lsdException w:name="Table Columns 1" w:semiHidden="1" w:unhideWhenUsed="1"/>
+    <w:lsdException w:name="Table Columns 2" w:semiHidden="1" w:unhideWhenUsed="1"/>
+    <w:lsdException w:name="Table Columns 3" w:semiHidden="1" w:unhideWhenUsed="1"/>
+    <w:lsdException w:name="Table Columns 4" w:semiHidden="1" w:unhideWhenUsed="1"/>
+    <w:lsdException w:name="Table Columns 5" w:semiHidden="1" w:unhideWhenUsed="1"/>
+    <w:lsdException w:name="Table Grid 1" w:semiHidden="1" w:unhideWhenUsed="1"/>
+    <w:lsdException w:name="Table Grid 2" w:semiHidden="1" w:unhideWhenUsed="1"/>
+    <w:lsdException w:name="Table Grid 3" w:semiHidden="1" w:unhideWhenUsed="1"/>
+    <w:lsdException w:name="Table Grid 4" w:semiHidden="1" w:unhideWhenUsed="1"/>
+    <w:lsdException w:name="Table Grid 5" w:semiHidden="1" w:unhideWhenUsed="1"/>
+    <w:lsdException w:name="Table Grid 6" w:semiHidden="1" w:unhideWhenUsed="1"/>
+    <w:lsdException w:name="Table Grid 7" w:semiHidden="1" w:unhideWhenUsed="1"/>
+    <w:lsdException w:name="Table Grid 8" w:semiHidden="1" w:unhideWhenUsed="1"/>
+    <w:lsdException w:name="Table List 1" w:semiHidden="1" w:unhideWhenUsed="1"/>
+    <w:lsdException w:name="Table List 2" w:semiHidden="1" w:unhideWhenUsed="1"/>
+    <w:lsdException w:name="Table List 3" w:semiHidden="1" w:unhideWhenUsed="1"/>
+    <w:lsdException w:name="Table List 4" w:semiHidden="1" w:unhideWhenUsed="1"/>
+    <w:lsdException w:name="Table List 5" w:semiHidden="1" w:unhideWhenUsed="1"/>
+    <w:lsdException w:name="Table List 6" w:semiHidden="1" w:unhideWhenUsed="1"/>
+    <w:lsdException w:name="Table List 7" w:semiHidden="1" w:unhideWhenUsed="1"/>
+    <w:lsdException w:name="Table List 8" w:semiHidden="1" w:unhideWhenUsed="1"/>
+    <w:lsdException w:name="Table 3D effects 1" w:semiHidden="1" w:unhideWhenUsed="1"/>
+    <w:lsdException w:name="Table 3D effects 2" w:semiHidden="1" w:unhideWhenUsed="1"/>
+    <w:lsdException w:name="Table 3D effects 3" w:semiHidden="1" w:unhideWhenUsed="1"/>
+    <w:lsdException w:name="Table Contemporary" w:semiHidden="1" w:unhideWhenUsed="1"/>
+    <w:lsdException w:name="Table Elegant" w:semiHidden="1" w:unhideWhenUsed="1"/>
+    <w:lsdException w:name="Table Professional" w:semiHidden="1" w:unhideWhenUsed="1"/>
+    <w:lsdException w:name="Table Subtle 1" w:semiHidden="1" w:unhideWhenUsed="1"/>
+    <w:lsdException w:name="Table Subtle 2" w:semiHidden="1" w:unhideWhenUsed="1"/>
+    <w:lsdException w:name="Table Web 1" w:semiHidden="1" w:unhideWhenUsed="1"/>
+    <w:lsdException w:name="Table Web 2" w:semiHidden="1" w:unhideWhenUsed="1"/>
+    <w:lsdException w:name="Table Web 3" w:semiHidden="1" w:unhideWhenUsed="1"/>
+    <w:lsdException w:name="Balloon Text" w:semiHidden="1" w:unhideWhenUsed="1"/>
+    <w:lsdException w:name="Table Grid" w:uiPriority="39"/>
+    <w:lsdException w:name="Table Theme" w:semiHidden="1" w:unhideWhenUsed="1"/>
+    <w:lsdException w:name="Placeholder Text" w:semiHidden="1"/>
+    <w:lsdException w:name="No Spacing" w:uiPriority="1" w:qFormat="1"/>
+    <w:lsdException w:name="Light Shading" w:uiPriority="60"/>
+    <w:lsdException w:name="Light List" w:uiPriority="61"/>
+    <w:lsdException w:name="Light Grid" w:uiPriority="62"/>
+    <w:lsdException w:name="Medium Shading 1" w:uiPriority="63"/>
+    <w:lsdException w:name="Medium Shading 2" w:uiPriority="64"/>
+    <w:lsdException w:name="Medium List 1" w:uiPriority="65"/>
+    <w:lsdException w:name="Medium List 2" w:uiPriority="66"/>
+    <w:lsdException w:name="Medium Grid 1" w:uiPriority="67"/>
+    <w:lsdException w:name="Medium Grid 2" w:uiPriority="68"/>
+    <w:lsdException w:name="Medium Grid 3" w:uiPriority="69"/>
+    <w:lsdException w:name="Dark List" w:uiPriority="70"/>
+    <w:lsdException w:name="Colorful Shading" w:uiPriority="71"/>
+    <w:lsdException w:name="Colorful List" w:uiPriority="72"/>
+    <w:lsdException w:name="Colorful Grid" w:uiPriority="73"/>
+    <w:lsdException w:name="Light Shading Accent 1" w:uiPriority="60"/>
+    <w:lsdException w:name="Light List Accent 1" w:uiPriority="61"/>
+    <w:lsdException w:name="Light Grid Accent 1" w:uiPriority="62"/>
+    <w:lsdException w:name="Medium Shading 1 Accent 1" w:uiPriority="63"/>
+    <w:lsdException w:name="Medium Shading 2 Accent 1" w:uiPriority="64"/>
+    <w:lsdException w:name="Medium List 1 Accent 1" w:uiPriority="65"/>
+    <w:lsdException w:name="Revision" w:semiHidden="1"/>
+    <w:lsdException w:name="List Paragraph" w:uiPriority="34" w:qFormat="1"/>
+    <w:lsdException w:name="Quote" w:uiPriority="29" w:qFormat="1"/>
+    <w:lsdException w:name="Intense Quote" w:uiPriority="30" w:qFormat="1"/>
+    <w:lsdException w:name="Medium List 2 Accent 1" w:uiPriority="66"/>
+    <w:lsdException w:name="Medium Grid 1 Accent 1" w:uiPriority="67"/>
+    <w:lsdException w:name="Medium Grid 2 Accent 1" w:uiPriority="68"/>
+    <w:lsdException w:name="Medium Grid 3 Accent 1" w:uiPriority="69"/>
+    <w:lsdException w:name="Dark List Accent 1" w:uiPriority="70"/>
+    <w:lsdException w:name="Colorful Shading Accent 1" w:uiPriority="71"/>
+    <w:lsdException w:name="Colorful List Accent 1" w:uiPriority="72"/>
+    <w:lsdException w:name="Colorful Grid Accent 1" w:uiPriority="73"/>
+    <w:lsdException w:name="Light Shading Accent 2" w:uiPriority="60"/>
+    <w:lsdException w:name="Light List Accent 2" w:uiPriority="61"/>
+    <w:lsdException w:name="Light Grid Accent 2" w:uiPriority="62"/>
+    <w:lsdException w:name="Medium Shading 1 Accent 2" w:uiPriority="63"/>
+    <w:lsdException w:name="Medium Shading 2 Accent 2" w:uiPriority="64"/>
+    <w:lsdException w:name="Medium List 1 Accent 2" w:uiPriority="65"/>
+    <w:lsdException w:name="Medium List 2 Accent 2" w:uiPriority="66"/>
+    <w:lsdException w:name="Medium Grid 1 Accent 2" w:uiPriority="67"/>
+    <w:lsdException w:name="Medium Grid 2 Accent 2" w:uiPriority="68"/>
+    <w:lsdException w:name="Medium Grid 3 Accent 2" w:uiPriority="69"/>
+    <w:lsdException w:name="Dark List Accent 2" w:uiPriority="70"/>
+    <w:lsdException w:name="Colorful Shading Accent 2" w:uiPriority="71"/>
+    <w:lsdException w:name="Colorful List Accent 2" w:uiPriority="72"/>
+    <w:lsdException w:name="Colorful Grid Accent 2" w:uiPriority="73"/>
+    <w:lsdException w:name="Light Shading Accent 3" w:uiPriority="60"/>
+    <w:lsdException w:name="Light List Accent 3" w:uiPriority="61"/>
+    <w:lsdException w:name="Light Grid Accent 3" w:uiPriority="62"/>
+    <w:lsdException w:name="Medium Shading 1 Accent 3" w:uiPriority="63"/>
+    <w:lsdException w:name="Medium Shading 2 Accent 3" w:uiPriority="64"/>
+    <w:lsdException w:name="Medium List 1 Accent 3" w:uiPriority="65"/>
+    <w:lsdException w:name="Medium List 2 Accent 3" w:uiPriority="66"/>
+    <w:lsdException w:name="Medium Grid 1 Accent 3" w:uiPriority="67"/>
+    <w:lsdException w:name="Medium Grid 2 Accent 3" w:uiPriority="68"/>
+    <w:lsdException w:name="Medium Grid 3 Accent 3" w:uiPriority="69"/>
+    <w:lsdException w:name="Dark List Accent 3" w:uiPriority="70"/>
+    <w:lsdException w:name="Colorful Shading Accent 3" w:uiPriority="71"/>
+    <w:lsdException w:name="Colorful List Accent 3" w:uiPriority="72"/>
+    <w:lsdException w:name="Colorful Grid Accent 3" w:uiPriority="73"/>
+    <w:lsdException w:name="Light Shading Accent 4" w:uiPriority="60"/>
+    <w:lsdException w:name="Light List Accent 4" w:uiPriority="61"/>
+    <w:lsdException w:name="Light Grid Accent 4" w:uiPriority="62"/>
+    <w:lsdException w:name="Medium Shading 1 Accent 4" w:uiPriority="63"/>
+    <w:lsdException w:name="Medium Shading 2 Accent 4" w:uiPriority="64"/>
+    <w:lsdException w:name="Medium List 1 Accent 4" w:uiPriority="65"/>
+    <w:lsdException w:name="Medium List 2 Accent 4" w:uiPriority="66"/>
+    <w:lsdException w:name="Medium Grid 1 Accent 4" w:uiPriority="67"/>
+    <w:lsdException w:name="Medium Grid 2 Accent 4" w:uiPriority="68"/>
+    <w:lsdException w:name="Medium Grid 3 Accent 4" w:uiPriority="69"/>
+    <w:lsdException w:name="Dark List Accent 4" w:uiPriority="70"/>
+    <w:lsdException w:name="Colorful Shading Accent 4" w:uiPriority="71"/>
+    <w:lsdException w:name="Colorful List Accent 4" w:uiPriority="72"/>
+    <w:lsdException w:name="Colorful Grid Accent 4" w:uiPriority="73"/>
+    <w:lsdException w:name="Light Shading Accent 5" w:uiPriority="60"/>
+    <w:lsdException w:name="Light List Accent 5" w:uiPriority="61"/>
+    <w:lsdException w:name="Light Grid Accent 5" w:uiPriority="62"/>
+    <w:lsdException w:name="Medium Shading 1 Accent 5" w:uiPriority="63"/>
+    <w:lsdException w:name="Medium Shading 2 Accent 5" w:uiPriority="64"/>
+    <w:lsdException w:name="Medium List 1 Accent 5" w:uiPriority="65"/>
+    <w:lsdException w:name="Medium List 2 Accent 5" w:uiPriority="66"/>
+    <w:lsdException w:name="Medium Grid 1 Accent 5" w:uiPriority="67"/>
+    <w:lsdException w:name="Medium Grid 2 Accent 5" w:uiPriority="68"/>
+    <w:lsdException w:name="Medium Grid 3 Accent 5" w:uiPriority="69"/>
+    <w:lsdException w:name="Dark List Accent 5" w:uiPriority="70"/>
+    <w:lsdException w:name="Colorful Shading Accent 5" w:uiPriority="71"/>
+    <w:lsdException w:name="Colorful List Accent 5" w:uiPriority="72"/>
+    <w:lsdException w:name="Colorful Grid Accent 5" w:uiPriority="73"/>
+    <w:lsdException w:name="Light Shading Accent 6" w:uiPriority="60"/>
+    <w:lsdException w:name="Light List Accent 6" w:uiPriority="61"/>
+    <w:lsdException w:name="Light Grid Accent 6" w:uiPriority="62"/>
+    <w:lsdException w:name="Medium Shading 1 Accent 6" w:uiPriority="63"/>
+    <w:lsdException w:name="Medium Shading 2 Accent 6" w:uiPriority="64"/>
+    <w:lsdException w:name="Medium List 1 Accent 6" w:uiPriority="65"/>
+    <w:lsdException w:name="Medium List 2 Accent 6" w:uiPriority="66"/>
+    <w:lsdException w:name="Medium Grid 1 Accent 6" w:uiPriority="67"/>
+    <w:lsdException w:name="Medium Grid 2 Accent 6" w:uiPriority="68"/>
+    <w:lsdException w:name="Medium Grid 3 Accent 6" w:uiPriority="69"/>
+    <w:lsdException w:name="Dark List Accent 6" w:uiPriority="70"/>
+    <w:lsdException w:name="Colorful Shading Accent 6" w:uiPriority="71"/>
+    <w:lsdException w:name="Colorful List Accent 6" w:uiPriority="72"/>
+    <w:lsdException w:name="Colorful Grid Accent 6" w:uiPriority="73"/>
+    <w:lsdException w:name="Subtle Emphasis" w:uiPriority="19" w:qFormat="1"/>
+    <w:lsdException w:name="Intense Emphasis" w:uiPriority="21" w:qFormat="1"/>
+    <w:lsdException w:name="Subtle Reference" w:uiPriority="31" w:qFormat="1"/>
+    <w:lsdException w:name="Intense Reference" w:uiPriority="32" w:qFormat="1"/>
+    <w:lsdException w:name="Book Title" w:uiPriority="33" w:qFormat="1"/>
+    <w:lsdException w:name="Bibliography" w:semiHidden="1" w:uiPriority="37" w:unhideWhenUsed="1"/>
+    <w:lsdException w:name="TOC Heading" w:semiHidden="1" w:uiPriority="39" w:unhideWhenUsed="1" w:qFormat="1"/>
+    <w:lsdException w:name="Plain Table 1" w:uiPriority="41"/>
+    <w:lsdException w:name="Plain Table 2" w:uiPriority="42"/>
+    <w:lsdException w:name="Plain Table 3" w:uiPriority="43"/>
+    <w:lsdException w:name="Plain Table 4" w:uiPriority="44"/>
+    <w:lsdException w:name="Plain Table 5" w:uiPriority="45"/>
+    <w:lsdException w:name="Grid Table Light" w:uiPriority="40"/>
+    <w:lsdException w:name="Grid Table 1 Light" w:uiPriority="46"/>
+    <w:lsdException w:name="Grid Table 2" w:uiPriority="47"/>
+    <w:lsdException w:name="Grid Table 3" w:uiPriority="48"/>
+    <w:lsdException w:name="Grid Table 4" w:uiPriority="49"/>
+    <w:lsdException w:name="Grid Table 5 Dark" w:uiPriority="50"/>
+    <w:lsdException w:name="Grid Table 6 Colorful" w:uiPriority="51"/>
+    <w:lsdException w:name="Grid Table 7 Colorful" w:uiPriority="52"/>
+    <w:lsdException w:name="Grid Table 1 Light Accent 1" w:uiPriority="46"/>
+    <w:lsdException w:name="Grid Table 2 Accent 1" w:uiPriority="47"/>
+    <w:lsdException w:name="Grid Table 3 Accent 1" w:uiPriority="48"/>
+    <w:lsdException w:name="Grid Table 4 Accent 1" w:uiPriority="49"/>
+    <w:lsdException w:name="Grid Table 5 Dark Accent 1" w:uiPriority="50"/>
+    <w:lsdException w:name="Grid Table 6 Colorful Accent 1" w:uiPriority="51"/>
+    <w:lsdException w:name="Grid Table 7 Colorful Accent 1" w:uiPriority="52"/>
+    <w:lsdException w:name="Grid Table 1 Light Accent 2" w:uiPriority="46"/>
+    <w:lsdException w:name="Grid Table 2 Accent 2" w:uiPriority="47"/>
+    <w:lsdException w:name="Grid Table 3 Accent 2" w:uiPriority="48"/>
+    <w:lsdException w:name="Grid Table 4 Accent 2" w:uiPriority="49"/>
+    <w:lsdException w:name="Grid Table 5 Dark Accent 2" w:uiPriority="50"/>
+    <w:lsdException w:name="Grid Table 6 Colorful Accent 2" w:uiPriority="51"/>
+    <w:lsdException w:name="Grid Table 7 Colorful Accent 2" w:uiPriority="52"/>
+    <w:lsdException w:name="Grid Table 1 Light Accent 3" w:uiPriority="46"/>
+    <w:lsdException w:name="Grid Table 2 Accent 3" w:uiPriority="47"/>
+    <w:lsdException w:name="Grid Table 3 Accent 3" w:uiPriority="48"/>
+    <w:lsdException w:name="Grid Table 4 Accent 3" w:uiPriority="49"/>
+    <w:lsdException w:name="Grid Table 5 Dark Accent 3" w:uiPriority="50"/>
+    <w:lsdException w:name="Grid Table 6 Colorful Accent 3" w:uiPriority="51"/>
+    <w:lsdException w:name="Grid Table 7 Colorful Accent 3" w:uiPriority="52"/>
+    <w:lsdException w:name="Grid Table 1 Light Accent 4" w:uiPriority="46"/>
+    <w:lsdException w:name="Grid Table 2 Accent 4" w:uiPriority="47"/>
+    <w:lsdException w:name="Grid Table 3 Accent 4" w:uiPriority="48"/>
+    <w:lsdException w:name="Grid Table 4 Accent 4" w:uiPriority="49"/>
+    <w:lsdException w:name="Grid Table 5 Dark Accent 4" w:uiPriority="50"/>
+    <w:lsdException w:name="Grid Table 6 Colorful Accent 4" w:uiPriority="51"/>
+    <w:lsdException w:name="Grid Table 7 Colorful Accent 4" w:uiPriority="52"/>
+    <w:lsdException w:name="Grid Table 1 Light Accent 5" w:uiPriority="46"/>
+    <w:lsdException w:name="Grid Table 2 Accent 5" w:uiPriority="47"/>
+    <w:lsdException w:name="Grid Table 3 Accent 5" w:uiPriority="48"/>
+    <w:lsdException w:name="Grid Table 4 Accent 5" w:uiPriority="49"/>
+    <w:lsdException w:name="Grid Table 5 Dark Accent 5" w:uiPriority="50"/>
+    <w:lsdException w:name="Grid Table 6 Colorful Accent 5" w:uiPriority="51"/>
+    <w:lsdException w:name="Grid Table 7 Colorful Accent 5" w:uiPriority="52"/>
+    <w:lsdException w:name="Grid Table 1 Light Accent 6" w:uiPriority="46"/>
+    <w:lsdException w:name="Grid Table 2 Accent 6" w:uiPriority="47"/>
+    <w:lsdException w:name="Grid Table 3 Accent 6" w:uiPriority="48"/>
+    <w:lsdException w:name="Grid Table 4 Accent 6" w:uiPriority="49"/>
+    <w:lsdException w:name="Grid Table 5 Dark Accent 6" w:uiPriority="50"/>
+    <w:lsdException w:name="Grid Table 6 Colorful Accent 6" w:uiPriority="51"/>
+    <w:lsdException w:name="Grid Table 7 Colorful Accent 6" w:uiPriority="52"/>
+    <w:lsdException w:name="List Table 1 Light" w:uiPriority="46"/>
+    <w:lsdException w:name="List Table 2" w:uiPriority="47"/>
+    <w:lsdException w:name="List Table 3" w:uiPriority="48"/>
+    <w:lsdException w:name="List Table 4" w:uiPriority="49"/>
+    <w:lsdException w:name="List Table 5 Dark" w:uiPriority="50"/>
+    <w:lsdException w:name="List Table 6 Colorful" w:uiPriority="51"/>
+    <w:lsdException w:name="List Table 7 Colorful" w:uiPriority="52"/>
+    <w:lsdException w:name="List Table 1 Light Accent 1" w:uiPriority="46"/>
+    <w:lsdException w:name="List Table 2 Accent 1" w:uiPriority="47"/>
+    <w:lsdException w:name="List Table 3 Accent 1" w:uiPriority="48"/>
+    <w:lsdException w:name="List Table 4 Accent 1" w:uiPriority="49"/>
+    <w:lsdException w:name="List Table 5 Dark Accent 1" w:uiPriority="50"/>
+    <w:lsdException w:name="List Table 6 Colorful Accent 1" w:uiPriority="51"/>
+    <w:lsdException w:name="List Table 7 Colorful Accent 1" w:uiPriority="52"/>
+    <w:lsdException w:name="List Table 1 Light Accent 2" w:uiPriority="46"/>
+    <w:lsdException w:name="List Table 2 Accent 2" w:uiPriority="47"/>
+    <w:lsdException w:name="List Table 3 Accent 2" w:uiPriority="48"/>
+    <w:lsdException w:name="List Table 4 Accent 2" w:uiPriority="49"/>
+    <w:lsdException w:name="List Table 5 Dark Accent 2" w:uiPriority="50"/>
+    <w:lsdException w:name="List Table 6 Colorful Accent 2" w:uiPriority="51"/>
+    <w:lsdException w:name="List Table 7 Colorful Accent 2" w:uiPriority="52"/>
+    <w:lsdException w:name="List Table 1 Light Accent 3" w:uiPriority="46"/>
+    <w:lsdException w:name="List Table 2 Accent 3" w:uiPriority="47"/>
+    <w:lsdException w:name="List Table 3 Accent 3" w:uiPriority="48"/>
+    <w:lsdException w:name="List Table 4 Accent 3" w:uiPriority="49"/>
+    <w:lsdException w:name="List Table 5 Dark Accent 3" w:uiPriority="50"/>
+    <w:lsdException w:name="List Table 6 Colorful Accent 3" w:uiPriority="51"/>
+    <w:lsdException w:name="List Table 7 Colorful Accent 3" w:uiPriority="52"/>
+    <w:lsdException w:name="List Table 1 Light Accent 4" w:uiPriority="46"/>
+    <w:lsdException w:name="List Table 2 Accent 4" w:uiPriority="47"/>
+    <w:lsdException w:name="List Table 3 Accent 4" w:uiPriority="48"/>
+    <w:lsdException w:name="List Table 4 Accent 4" w:uiPriority="49"/>
+    <w:lsdException w:name="List Table 5 Dark Accent 4" w:uiPriority="50"/>
+    <w:lsdException w:name="List Table 6 Colorful Accent 4" w:uiPriority="51"/>
+    <w:lsdException w:name="List Table 7 Colorful Accent 4" w:uiPriority="52"/>
+    <w:lsdException w:name="List Table 1 Light Accent 5" w:uiPriority="46"/>
+    <w:lsdException w:name="List Table 2 Accent 5" w:uiPriority="47"/>
+    <w:lsdException w:name="List Table 3 Accent 5" w:uiPriority="48"/>
+    <w:lsdException w:name="List Table 4 Accent 5" w:uiPriority="49"/>
+    <w:lsdException w:name="List Table 5 Dark Accent 5" w:uiPriority="50"/>
+    <w:lsdException w:name="List Table 6 Colorful Accent 5" w:uiPriority="51"/>
+    <w:lsdException w:name="List Table 7 Colorful Accent 5" w:uiPriority="52"/>
+    <w:lsdException w:name="List Table 1 Light Accent 6" w:uiPriority="46"/>
+    <w:lsdException w:name="List Table 2 Accent 6" w:uiPriority="47"/>
+    <w:lsdException w:name="List Table 3 Accent 6" w:uiPriority="48"/>
+    <w:lsdException w:name="List Table 4 Accent 6" w:uiPriority="49"/>
+    <w:lsdException w:name="List Table 5 Dark Accent 6" w:uiPriority="50"/>
+    <w:lsdException w:name="List Table 6 Colorful Accent 6" w:uiPriority="51"/>
+    <w:lsdException w:name="List Table 7 Colorful Accent 6" w:uiPriority="52"/>
+    <w:lsdException w:name="Mention" w:semiHidden="1" w:unhideWhenUsed="1"/>
+    <w:lsdException w:name="Smart Hyperlink" w:semiHidden="1" w:unhideWhenUsed="1"/>
+    <w:lsdException w:name="Hashtag" w:semiHidden="1" w:unhideWhenUsed="1"/>
+    <w:lsdException w:name="Unresolved Mention" w:semiHidden="1" w:unhideWhenUsed="1"/>
+    <w:lsdException w:name="Smart Link" w:semiHidden="1" w:unhideWhenUsed="1"/>
+  </w:latentStyles>
+  <w:style w:type="paragraph" w:default="1" w:styleId="Normal">
+    <w:name w:val="Normal"/>
+    <w:qFormat/>
+  </w:style>
+  <w:style w:type="character" w:default="1" w:styleId="DefaultParagraphFont">
+    <w:name w:val="Default Paragraph Font"/>
+    <w:uiPriority w:val="1"/>
+    <w:semiHidden/>
+    <w:unhideWhenUsed/>
+  </w:style>
+  <w:style w:type="table" w:default="1" w:styleId="TableNormal">
+    <w:name w:val="Normal Table"/>
+    <w:uiPriority w:val="99"/>
+    <w:semiHidden/>
+    <w:unhideWhenUsed/>
+    <w:tblPr>
+      <w:tblInd w:w="0" w:type="dxa"/>
+      <w:tblCellMar>
+        <w:top w:w="0" w:type="dxa"/>
+        <w:left w:w="108" w:type="dxa"/>
+        <w:bottom w:w="0" w:type="dxa"/>
+        <w:right w:w="108" w:type="dxa"/>
+      </w:tblCellMar>
+    </w:tblPr>
+  </w:style>
+  <w:style w:type="numbering" w:default="1" w:styleId="NoList">
+    <w:name w:val="No List"/>
+    <w:uiPriority w:val="99"/>
+    <w:semiHidden/>
+    <w:unhideWhenUsed/>
+  </w:style>
+  <w:style w:type="character" w:styleId="PlaceholderText">
+    <w:name w:val="Placeholder Text"/>
+    <w:basedOn w:val="DefaultParagraphFont"/>
+    <w:uiPriority w:val="99"/>
+    <w:semiHidden/>
+    <w:rsid w:val="00D87788"/>
+    <w:rPr>
+      <w:color w:val="808080"/>
+    </w:rPr>
+  </w:style>
+</w:styles>
+</file>
+
+<file path=word/glossary/webSettings.xml><?xml version="1.0" encoding="utf-8"?>
+<w:webSettings xmlns:mc="http://schemas.openxmlformats.org/markup-compatibility/2006" xmlns:r="http://schemas.openxmlformats.org/officeDocument/2006/relationships" xmlns:w="http://schemas.openxmlformats.org/wordprocessingml/2006/main" xmlns:w14="http://schemas.microsoft.com/office/word/2010/wordml" xmlns:w15="http://schemas.microsoft.com/office/word/2012/wordml" xmlns:w16cex="http://schemas.microsoft.com/office/word/2018/wordml/cex" xmlns:w16cid="http://schemas.microsoft.com/office/word/2016/wordml/cid" xmlns:w16="http://schemas.microsoft.com/office/word/2018/wordml" xmlns:w16sdtdh="http://schemas.microsoft.com/office/word/2020/wordml/sdtdatahash" xmlns:w16se="http://schemas.microsoft.com/office/word/2015/wordml/symex" mc:Ignorable="w14 w15 w16se w16cid w16 w16cex w16sdtdh">
+  <w:optimizeForBrowser/>
+  <w:allowPNG/>
+</w:webSettings>
+</file>
+
 <file path=word/theme/theme1.xml><?xml version="1.0" encoding="utf-8"?>
 <a:theme xmlns:a="http://schemas.openxmlformats.org/drawingml/2006/main" name="Office Theme">
   <a:themeElements>
@@ -9401,4 +10525,39 @@
     </a:ext>
   </a:extLst>
 </a:theme>
+</file>
+
+<file path=word/webextensions/taskpanes.xml><?xml version="1.0" encoding="utf-8"?>
+<wetp:taskpanes xmlns:wetp="http://schemas.microsoft.com/office/webextensions/taskpanes/2010/11">
+  <wetp:taskpane dockstate="right" visibility="0" width="350" row="2">
+    <wetp:webextensionref xmlns:r="http://schemas.openxmlformats.org/officeDocument/2006/relationships" r:id="rId1"/>
+  </wetp:taskpane>
+</wetp:taskpanes>
+</file>
+
+<file path=word/webextensions/webextension1.xml><?xml version="1.0" encoding="utf-8"?>
+<we:webextension xmlns:we="http://schemas.microsoft.com/office/webextensions/webextension/2010/11" id="{187E9341-95A5-4906-8D39-0200C76B6B4E}">
+  <we:reference id="wa104382081" version="1.55.1.0" store="en-US" storeType="OMEX"/>
+  <we:alternateReferences>
+    <we:reference id="wa104382081" version="1.55.1.0" store="" storeType="OMEX"/>
+  </we:alternateReferences>
+  <we:properties>
+    <we:property name="MENDELEY_CITATIONS" value="[{&quot;citationID&quot;:&quot;MENDELEY_CITATION_ccbd67fe-07a7-4723-9a47-0340093ce9db&quot;,&quot;properties&quot;:{&quot;noteIndex&quot;:0},&quot;isEdited&quot;:false,&quot;manualOverride&quot;:{&quot;isManuallyOverridden&quot;:false,&quot;citeprocText&quot;:&quot;[1]&quot;,&quot;manualOverrideText&quot;:&quot;&quot;},&quot;citationTag&quot;:&quot;MENDELEY_CITATION_v3_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&quot;,&quot;citationItems&quot;:[{&quot;id&quot;:&quot;148cfd5c-2686-31e6-84c0-f232cc93113f&quot;,&quot;itemData&quot;:{&quot;type&quot;:&quot;article-journal&quot;,&quot;id&quot;:&quot;148cfd5c-2686-31e6-84c0-f232cc93113f&quot;,&quot;title&quot;:&quot;A FOURTH-ORDER ACCURATE FINITE-VOLUME METHOD WITH STRUCTURED ADAPTIVE MESH REFINEMENT FOR SOLVING THE ADVECTION-DIFFUSION EQUATION *&quot;,&quot;author&quot;:[{&quot;family&quot;:&quot;Zhang&quot;,&quot;given&quot;:&quot;Qinghai&quot;,&quot;parse-names&quot;:false,&quot;dropping-particle&quot;:&quot;&quot;,&quot;non-dropping-particle&quot;:&quot;&quot;},{&quot;family&quot;:&quot;Johansen&quot;,&quot;given&quot;:&quot;Hans&quot;,&quot;parse-names&quot;:false,&quot;dropping-particle&quot;:&quot;&quot;,&quot;non-dropping-particle&quot;:&quot;&quot;},{&quot;family&quot;:&quot;Colella&quot;,&quot;given&quot;:&quot;Phillip&quot;,&quot;parse-names&quot;:false,&quot;dropping-particle&quot;:&quot;&quot;,&quot;non-dropping-particle&quot;:&quot;&quot;}],&quot;accessed&quot;:{&quot;date-parts&quot;:[[2023,4,30]]},&quot;DOI&quot;:&quot;10.1137/110820105&quot;,&quot;URL&quot;:&quot;http://www.siam.org/journals/sisc/34-2/82010.html&quot;,&quot;abstract&quot;:&quot;We present a fourth-order accurate algorithm for solving Poisson's equation, the heat equation, and the advection-diffusion equation on a hierarchy of block-structured, adaptively refined grids. For spatial discretization, finite-volume stencils are derived for the divergence operator and Laplacian operator in the context of structured adaptive mesh refinement and a variety of boundary conditions; the resulting linear system is solved with a multigrid algorithm. For time integration, we couple the elliptic solver to a fourth-order accurate Runge-Kutta method, introduced by Kennedy and Carpenter [Appl. Numer. Math., 44 (2003), pp. 139-181], which enables us to treat the nonstiff advection term explicitly and the stiff diffusion term implicitly. We demonstrate the spatial and temporal accuracy by comparing results with analytical solutions. Because of the general formulation of the approach, the algorithm is easily extensible to more complex physical systems. 1. Introduction. The advection-diffusion equation governs numerous physical processes. Morton [17] lists ten sample applications ranging from semiconductor simulation to financial modelling. He also observes that \&quot;Accurate modelling of the interaction between convective and diffusive processes is the most ubiquitous and challenging task in the numerical approximation of partial differential equations.\&quot; This observation is partly due to the fact that algorithms and analysis tend to be very different in the two limiting cases of elliptic and hyperbolic equations. Also, even for very simple initial and boundary conditions, the true solution may contain multiple length-scales that vary drastically across the spatial domain; see (3.1) in [18] for such an example. A finite-volume (FV) formulation is often preferred for applications where conservation is a primary concern. In its simplest form, the FV formulation is derived by applying the divergence theorem over the cells of a regular computational grid:&quot;,&quot;container-title-short&quot;:&quot;&quot;},&quot;isTemporary&quot;:false}]}]"/>
+    <we:property name="MENDELEY_CITATIONS_STYLE" value="{&quot;id&quot;:&quot;https://www.zotero.org/styles/ieee&quot;,&quot;title&quot;:&quot;IEEE&quot;,&quot;format&quot;:&quot;numeric&quot;,&quot;defaultLocale&quot;:null,&quot;isLocaleCodeValid&quot;:true}"/>
+  </we:properties>
+  <we:bindings/>
+  <we:snapshot xmlns:r="http://schemas.openxmlformats.org/officeDocument/2006/relationships"/>
+</we:webextension>
+</file>
+
+<file path=customXml/item1.xml><?xml version="1.0" encoding="utf-8"?>
+<b:Sources xmlns:b="http://schemas.openxmlformats.org/officeDocument/2006/bibliography" xmlns="http://schemas.openxmlformats.org/officeDocument/2006/bibliography" SelectedStyle="\IEEE2006OfficeOnline.xsl" StyleName="IEEE" Version="2006"/>
+</file>
+
+<file path=customXml/itemProps1.xml><?xml version="1.0" encoding="utf-8"?>
+<ds:datastoreItem xmlns:ds="http://schemas.openxmlformats.org/officeDocument/2006/customXml" ds:itemID="{E5D46D33-97BC-48F6-BDC0-0BC00B55CA33}">
+  <ds:schemaRefs>
+    <ds:schemaRef ds:uri="http://schemas.openxmlformats.org/officeDocument/2006/bibliography"/>
+  </ds:schemaRefs>
+</ds:datastoreItem>
 </file>
</xml_diff>